<commit_message>
Day4-Calculator: guard divide-by-zero in MathPlugin, add project.md
double division by zero doesn't throw, it silently returns
Infinity/NaN, giving the model a confusing non-numeric tool result.
Divide now throws a descriptive DivideByZeroException instead. Syncs
the docx's Complete Code listing and replaces missing.md with
project.md.
</commit_message>
<xml_diff>
--- a/Day4-Calculator.docx
+++ b/Day4-Calculator.docx
@@ -105,11 +105,7 @@
         <w:ind w:left="1080"/>
       </w:pPr>
       <w:r>
-        <w:t xml:space="preserve">Note: This lesson spans two files — `Program.cs` (the </w:t>
-      </w:r>
-      <w:r>
-        <w:lastRenderedPageBreak/>
-        <w:t>app entry point) and `MathPlugin.cs` (the native plugin) — because plugins are meant to be written as standalone, reusable classes rather than inline code.</w:t>
+        <w:t>Note: This lesson spans two files — `Program.cs` (the app entry point) and `MathPlugin.cs` (the native plugin) — because plugins are meant to be written as standalone, reusable classes rather than inline code.</w:t>
       </w:r>
     </w:p>
     <w:p/>
@@ -153,6 +149,7 @@
         <w:rPr>
           <w:b/>
         </w:rPr>
+        <w:lastRenderedPageBreak/>
         <w:t>The [KernelFunction] Attribute</w:t>
       </w:r>
       <w:r>
@@ -194,11 +191,7 @@
         <w:t>Registering Plugins</w:t>
       </w:r>
       <w:r>
-        <w:t>: `builder.Plugins.AddFromType&lt;MathPlugin&gt;(</w:t>
-      </w:r>
-      <w:r>
-        <w:lastRenderedPageBreak/>
-        <w:t>"Math")` registers the class with the kernel under the namespace `"Math"`, making its functions callable as `Math.Add`, `Math.Subtract`, etc.</w:t>
+        <w:t>: `builder.Plugins.AddFromType&lt;MathPlugin&gt;("Math")` registers the class with the kernel under the namespace `"Math"`, making its functions callable as `Math.Add`, `Math.Subtract`, etc.</w:t>
       </w:r>
     </w:p>
     <w:p>
@@ -322,47 +315,904 @@
           <w:rFonts w:ascii="Consolas" w:hAnsi="Consolas"/>
           <w:sz w:val="19"/>
         </w:rPr>
-        <w:t>// precise arithmetic. Thi</w:t>
-      </w:r>
+        <w:t>// precise arithmetic. This episode fixes that by wrapping real C# math in a</w:t>
+      </w:r>
+    </w:p>
+    <w:p>
+      <w:pPr>
+        <w:pStyle w:val="NoSpacing"/>
+        <w:rPr>
+          <w:rFonts w:ascii="Consolas" w:hAnsi="Consolas"/>
+          <w:sz w:val="19"/>
+        </w:rPr>
+      </w:pPr>
+      <w:r>
+        <w:rPr>
+          <w:rFonts w:ascii="Consolas" w:hAnsi="Consolas"/>
+          <w:sz w:val="19"/>
+        </w:rPr>
+        <w:t>// native plugin (see MathPlugIn.cs) and enabling auto tool-invocation, so the</w:t>
+      </w:r>
+    </w:p>
+    <w:p>
+      <w:pPr>
+        <w:pStyle w:val="NoSpacing"/>
+        <w:rPr>
+          <w:rFonts w:ascii="Consolas" w:hAnsi="Consolas"/>
+          <w:sz w:val="19"/>
+        </w:rPr>
+      </w:pPr>
+      <w:r>
+        <w:rPr>
+          <w:rFonts w:ascii="Consolas" w:hAnsi="Consolas"/>
+          <w:sz w:val="19"/>
+        </w:rPr>
+        <w:t>// model can pause generation, call our code for the exact answer, and resume.</w:t>
+      </w:r>
+    </w:p>
+    <w:p>
+      <w:pPr>
+        <w:pStyle w:val="NoSpacing"/>
+        <w:rPr>
+          <w:rFonts w:ascii="Consolas" w:hAnsi="Consolas"/>
+          <w:sz w:val="19"/>
+        </w:rPr>
+      </w:pPr>
+      <w:r>
+        <w:rPr>
+          <w:rFonts w:ascii="Consolas" w:hAnsi="Consolas"/>
+          <w:sz w:val="19"/>
+        </w:rPr>
+        <w:t>using Microsoft.SemanticKernel;</w:t>
+      </w:r>
+    </w:p>
+    <w:p>
+      <w:pPr>
+        <w:pStyle w:val="NoSpacing"/>
+        <w:rPr>
+          <w:rFonts w:ascii="Consolas" w:hAnsi="Consolas"/>
+          <w:sz w:val="19"/>
+        </w:rPr>
+      </w:pPr>
+      <w:r>
+        <w:rPr>
+          <w:rFonts w:ascii="Consolas" w:hAnsi="Consolas"/>
+          <w:sz w:val="19"/>
+        </w:rPr>
+        <w:t>using Microsoft.SemanticKernel.Connectors.Google;</w:t>
+      </w:r>
+    </w:p>
+    <w:p>
+      <w:pPr>
+        <w:pStyle w:val="NoSpacing"/>
+        <w:rPr>
+          <w:rFonts w:ascii="Consolas" w:hAnsi="Consolas"/>
+          <w:sz w:val="19"/>
+        </w:rPr>
+      </w:pPr>
+      <w:r>
+        <w:rPr>
+          <w:rFonts w:ascii="Consolas" w:hAnsi="Consolas"/>
+          <w:sz w:val="19"/>
+        </w:rPr>
+        <w:t>using System.ComponentModel;</w:t>
+      </w:r>
+    </w:p>
+    <w:p>
+      <w:pPr>
+        <w:pStyle w:val="NoSpacing"/>
+        <w:rPr>
+          <w:rFonts w:ascii="Consolas" w:hAnsi="Consolas"/>
+          <w:sz w:val="19"/>
+        </w:rPr>
+      </w:pPr>
+    </w:p>
+    <w:p>
+      <w:pPr>
+        <w:pStyle w:val="NoSpacing"/>
+        <w:rPr>
+          <w:rFonts w:ascii="Consolas" w:hAnsi="Consolas"/>
+          <w:sz w:val="19"/>
+        </w:rPr>
+      </w:pPr>
+      <w:r>
+        <w:rPr>
+          <w:rFonts w:ascii="Consolas" w:hAnsi="Consolas"/>
+          <w:sz w:val="19"/>
+        </w:rPr>
+        <w:t>namespace Calculator</w:t>
+      </w:r>
+    </w:p>
+    <w:p>
+      <w:pPr>
+        <w:pStyle w:val="NoSpacing"/>
+        <w:rPr>
+          <w:rFonts w:ascii="Consolas" w:hAnsi="Consolas"/>
+          <w:sz w:val="19"/>
+        </w:rPr>
+      </w:pPr>
+      <w:r>
+        <w:rPr>
+          <w:rFonts w:ascii="Consolas" w:hAnsi="Consolas"/>
+          <w:sz w:val="19"/>
+        </w:rPr>
+        <w:t>{</w:t>
+      </w:r>
+    </w:p>
+    <w:p>
+      <w:pPr>
+        <w:pStyle w:val="NoSpacing"/>
+        <w:rPr>
+          <w:rFonts w:ascii="Consolas" w:hAnsi="Consolas"/>
+          <w:sz w:val="19"/>
+        </w:rPr>
+      </w:pPr>
+    </w:p>
+    <w:p>
+      <w:pPr>
+        <w:pStyle w:val="NoSpacing"/>
+        <w:rPr>
+          <w:rFonts w:ascii="Consolas" w:hAnsi="Consolas"/>
+          <w:sz w:val="19"/>
+        </w:rPr>
+      </w:pPr>
+      <w:r>
+        <w:rPr>
+          <w:rFonts w:ascii="Consolas" w:hAnsi="Consolas"/>
+          <w:sz w:val="19"/>
+        </w:rPr>
+        <w:t xml:space="preserve">    public class Program</w:t>
+      </w:r>
+    </w:p>
+    <w:p>
+      <w:pPr>
+        <w:pStyle w:val="NoSpacing"/>
+        <w:rPr>
+          <w:rFonts w:ascii="Consolas" w:hAnsi="Consolas"/>
+          <w:sz w:val="19"/>
+        </w:rPr>
+      </w:pPr>
+      <w:r>
+        <w:rPr>
+          <w:rFonts w:ascii="Consolas" w:hAnsi="Consolas"/>
+          <w:sz w:val="19"/>
+        </w:rPr>
+        <w:t xml:space="preserve">    {</w:t>
+      </w:r>
+    </w:p>
+    <w:p>
+      <w:pPr>
+        <w:pStyle w:val="NoSpacing"/>
+        <w:rPr>
+          <w:rFonts w:ascii="Consolas" w:hAnsi="Consolas"/>
+          <w:sz w:val="19"/>
+        </w:rPr>
+      </w:pPr>
+      <w:r>
+        <w:rPr>
+          <w:rFonts w:ascii="Consolas" w:hAnsi="Consolas"/>
+          <w:sz w:val="19"/>
+        </w:rPr>
+        <w:t xml:space="preserve">        static async Task Main(string[] args)</w:t>
+      </w:r>
+    </w:p>
+    <w:p>
+      <w:pPr>
+        <w:pStyle w:val="NoSpacing"/>
+        <w:rPr>
+          <w:rFonts w:ascii="Consolas" w:hAnsi="Consolas"/>
+          <w:sz w:val="19"/>
+        </w:rPr>
+      </w:pPr>
+      <w:r>
+        <w:rPr>
+          <w:rFonts w:ascii="Consolas" w:hAnsi="Consolas"/>
+          <w:sz w:val="19"/>
+        </w:rPr>
+        <w:t xml:space="preserve">        {</w:t>
+      </w:r>
+    </w:p>
+    <w:p>
+      <w:pPr>
+        <w:pStyle w:val="NoSpacing"/>
+        <w:rPr>
+          <w:rFonts w:ascii="Consolas" w:hAnsi="Consolas"/>
+          <w:sz w:val="19"/>
+        </w:rPr>
+      </w:pPr>
+      <w:r>
+        <w:rPr>
+          <w:rFonts w:ascii="Consolas" w:hAnsi="Consolas"/>
+          <w:sz w:val="19"/>
+        </w:rPr>
+        <w:t xml:space="preserve">            // Step 2: Init the kernel</w:t>
+      </w:r>
+    </w:p>
+    <w:p>
+      <w:pPr>
+        <w:pStyle w:val="NoSpacing"/>
+        <w:rPr>
+          <w:rFonts w:ascii="Consolas" w:hAnsi="Consolas"/>
+          <w:sz w:val="19"/>
+        </w:rPr>
+      </w:pPr>
+      <w:r>
+        <w:rPr>
+          <w:rFonts w:ascii="Consolas" w:hAnsi="Consolas"/>
+          <w:sz w:val="19"/>
+        </w:rPr>
+        <w:t xml:space="preserve">            var builder = Kernel.CreateBuilder();</w:t>
+      </w:r>
+    </w:p>
+    <w:p>
+      <w:pPr>
+        <w:pStyle w:val="NoSpacing"/>
+        <w:rPr>
+          <w:rFonts w:ascii="Consolas" w:hAnsi="Consolas"/>
+          <w:sz w:val="19"/>
+        </w:rPr>
+      </w:pPr>
       <w:r>
         <w:rPr>
           <w:rFonts w:ascii="Consolas" w:hAnsi="Consolas"/>
           <w:sz w:val="19"/>
         </w:rPr>
         <w:lastRenderedPageBreak/>
-        <w:t>s episode fixes that by wrapping real C# math in a</w:t>
-      </w:r>
-    </w:p>
-    <w:p>
-      <w:pPr>
-        <w:pStyle w:val="NoSpacing"/>
-        <w:rPr>
-          <w:rFonts w:ascii="Consolas" w:hAnsi="Consolas"/>
-          <w:sz w:val="19"/>
-        </w:rPr>
-      </w:pPr>
-      <w:r>
-        <w:rPr>
-          <w:rFonts w:ascii="Consolas" w:hAnsi="Consolas"/>
-          <w:sz w:val="19"/>
-        </w:rPr>
-        <w:t>// native plugin (see MathPlugIn.cs) and enabling auto tool-invocation, so the</w:t>
-      </w:r>
-    </w:p>
-    <w:p>
-      <w:pPr>
-        <w:pStyle w:val="NoSpacing"/>
-        <w:rPr>
-          <w:rFonts w:ascii="Consolas" w:hAnsi="Consolas"/>
-          <w:sz w:val="19"/>
-        </w:rPr>
-      </w:pPr>
-      <w:r>
-        <w:rPr>
-          <w:rFonts w:ascii="Consolas" w:hAnsi="Consolas"/>
-          <w:sz w:val="19"/>
-        </w:rPr>
-        <w:t>// model can pause generation, call our code for the exact answer, and resume.</w:t>
+        <w:t xml:space="preserve">            string apiKey = Environment.GetEnvironmentVariable("GEMINI_API_KEY")</w:t>
+      </w:r>
+    </w:p>
+    <w:p>
+      <w:pPr>
+        <w:pStyle w:val="NoSpacing"/>
+        <w:rPr>
+          <w:rFonts w:ascii="Consolas" w:hAnsi="Consolas"/>
+          <w:sz w:val="19"/>
+        </w:rPr>
+      </w:pPr>
+      <w:r>
+        <w:rPr>
+          <w:rFonts w:ascii="Consolas" w:hAnsi="Consolas"/>
+          <w:sz w:val="19"/>
+        </w:rPr>
+        <w:t xml:space="preserve">                ?? throw new Exception("GEMINI_API_KEY environment variable not set");</w:t>
+      </w:r>
+    </w:p>
+    <w:p>
+      <w:pPr>
+        <w:pStyle w:val="NoSpacing"/>
+        <w:rPr>
+          <w:rFonts w:ascii="Consolas" w:hAnsi="Consolas"/>
+          <w:sz w:val="19"/>
+        </w:rPr>
+      </w:pPr>
+      <w:r>
+        <w:rPr>
+          <w:rFonts w:ascii="Consolas" w:hAnsi="Consolas"/>
+          <w:sz w:val="19"/>
+        </w:rPr>
+        <w:t xml:space="preserve">            string modelId = "gemini-2.5-flash";</w:t>
+      </w:r>
+    </w:p>
+    <w:p>
+      <w:pPr>
+        <w:pStyle w:val="NoSpacing"/>
+        <w:rPr>
+          <w:rFonts w:ascii="Consolas" w:hAnsi="Consolas"/>
+          <w:sz w:val="19"/>
+        </w:rPr>
+      </w:pPr>
+    </w:p>
+    <w:p>
+      <w:pPr>
+        <w:pStyle w:val="NoSpacing"/>
+        <w:rPr>
+          <w:rFonts w:ascii="Consolas" w:hAnsi="Consolas"/>
+          <w:sz w:val="19"/>
+        </w:rPr>
+      </w:pPr>
+      <w:r>
+        <w:rPr>
+          <w:rFonts w:ascii="Consolas" w:hAnsi="Consolas"/>
+          <w:sz w:val="19"/>
+        </w:rPr>
+        <w:t xml:space="preserve">            builder.AddGoogleAIGeminiChatCompletion(modelId, apiKey);</w:t>
+      </w:r>
+    </w:p>
+    <w:p>
+      <w:pPr>
+        <w:pStyle w:val="NoSpacing"/>
+        <w:rPr>
+          <w:rFonts w:ascii="Consolas" w:hAnsi="Consolas"/>
+          <w:sz w:val="19"/>
+        </w:rPr>
+      </w:pPr>
+    </w:p>
+    <w:p>
+      <w:pPr>
+        <w:pStyle w:val="NoSpacing"/>
+        <w:rPr>
+          <w:rFonts w:ascii="Consolas" w:hAnsi="Consolas"/>
+          <w:sz w:val="19"/>
+        </w:rPr>
+      </w:pPr>
+      <w:r>
+        <w:rPr>
+          <w:rFonts w:ascii="Consolas" w:hAnsi="Consolas"/>
+          <w:sz w:val="19"/>
+        </w:rPr>
+        <w:t xml:space="preserve">            // Step 3: Load the native plug in</w:t>
+      </w:r>
+    </w:p>
+    <w:p>
+      <w:pPr>
+        <w:pStyle w:val="NoSpacing"/>
+        <w:rPr>
+          <w:rFonts w:ascii="Consolas" w:hAnsi="Consolas"/>
+          <w:sz w:val="19"/>
+        </w:rPr>
+      </w:pPr>
+      <w:r>
+        <w:rPr>
+          <w:rFonts w:ascii="Consolas" w:hAnsi="Consolas"/>
+          <w:sz w:val="19"/>
+        </w:rPr>
+        <w:t xml:space="preserve">            builder.Plugins.AddFromType&lt;MathPlugin&gt;("Math");</w:t>
+      </w:r>
+    </w:p>
+    <w:p>
+      <w:pPr>
+        <w:pStyle w:val="NoSpacing"/>
+        <w:rPr>
+          <w:rFonts w:ascii="Consolas" w:hAnsi="Consolas"/>
+          <w:sz w:val="19"/>
+        </w:rPr>
+      </w:pPr>
+    </w:p>
+    <w:p>
+      <w:pPr>
+        <w:pStyle w:val="NoSpacing"/>
+        <w:rPr>
+          <w:rFonts w:ascii="Consolas" w:hAnsi="Consolas"/>
+          <w:sz w:val="19"/>
+        </w:rPr>
+      </w:pPr>
+      <w:r>
+        <w:rPr>
+          <w:rFonts w:ascii="Consolas" w:hAnsi="Consolas"/>
+          <w:sz w:val="19"/>
+        </w:rPr>
+        <w:t xml:space="preserve">            Kernel kernel = builder.Build();</w:t>
+      </w:r>
+    </w:p>
+    <w:p>
+      <w:pPr>
+        <w:pStyle w:val="NoSpacing"/>
+        <w:rPr>
+          <w:rFonts w:ascii="Consolas" w:hAnsi="Consolas"/>
+          <w:sz w:val="19"/>
+        </w:rPr>
+      </w:pPr>
+    </w:p>
+    <w:p>
+      <w:pPr>
+        <w:pStyle w:val="NoSpacing"/>
+        <w:rPr>
+          <w:rFonts w:ascii="Consolas" w:hAnsi="Consolas"/>
+          <w:sz w:val="19"/>
+        </w:rPr>
+      </w:pPr>
+      <w:r>
+        <w:rPr>
+          <w:rFonts w:ascii="Consolas" w:hAnsi="Consolas"/>
+          <w:sz w:val="19"/>
+        </w:rPr>
+        <w:t xml:space="preserve">            // Step 4: Math word problem</w:t>
+      </w:r>
+    </w:p>
+    <w:p>
+      <w:pPr>
+        <w:pStyle w:val="NoSpacing"/>
+        <w:rPr>
+          <w:rFonts w:ascii="Consolas" w:hAnsi="Consolas"/>
+          <w:sz w:val="19"/>
+        </w:rPr>
+      </w:pPr>
+      <w:r>
+        <w:rPr>
+          <w:rFonts w:ascii="Consolas" w:hAnsi="Consolas"/>
+          <w:sz w:val="19"/>
+        </w:rPr>
+        <w:t xml:space="preserve">            string prompt = "I had 124 apples.  I ate 15 of them.  Then I multiplied the amount of apples I had left by 3.  Finally, I divided all my apples equally among myself and 3 friends.  How many apples did each person get?  Do all math using my tools.  Show your work step by step.";</w:t>
+      </w:r>
+    </w:p>
+    <w:p>
+      <w:pPr>
+        <w:pStyle w:val="NoSpacing"/>
+        <w:rPr>
+          <w:rFonts w:ascii="Consolas" w:hAnsi="Consolas"/>
+          <w:sz w:val="19"/>
+        </w:rPr>
+      </w:pPr>
+    </w:p>
+    <w:p>
+      <w:pPr>
+        <w:pStyle w:val="NoSpacing"/>
+        <w:rPr>
+          <w:rFonts w:ascii="Consolas" w:hAnsi="Consolas"/>
+          <w:sz w:val="19"/>
+        </w:rPr>
+      </w:pPr>
+      <w:r>
+        <w:rPr>
+          <w:rFonts w:ascii="Consolas" w:hAnsi="Consolas"/>
+          <w:sz w:val="19"/>
+        </w:rPr>
+        <w:t xml:space="preserve">            // Step 5: Enable Auto-Invocation of the tools. Without this, the</w:t>
+      </w:r>
+    </w:p>
+    <w:p>
+      <w:pPr>
+        <w:pStyle w:val="NoSpacing"/>
+        <w:rPr>
+          <w:rFonts w:ascii="Consolas" w:hAnsi="Consolas"/>
+          <w:sz w:val="19"/>
+        </w:rPr>
+      </w:pPr>
+      <w:r>
+        <w:rPr>
+          <w:rFonts w:ascii="Consolas" w:hAnsi="Consolas"/>
+          <w:sz w:val="19"/>
+        </w:rPr>
+        <w:t xml:space="preserve">            // model would know the Math plugin exists but wouldn't have</w:t>
+      </w:r>
+    </w:p>
+    <w:p>
+      <w:pPr>
+        <w:pStyle w:val="NoSpacing"/>
+        <w:rPr>
+          <w:rFonts w:ascii="Consolas" w:hAnsi="Consolas"/>
+          <w:sz w:val="19"/>
+        </w:rPr>
+      </w:pPr>
+      <w:r>
+        <w:rPr>
+          <w:rFonts w:ascii="Consolas" w:hAnsi="Consolas"/>
+          <w:sz w:val="19"/>
+        </w:rPr>
+        <w:t xml:space="preserve">            // permission to call it - it would just try (and fail) to guess</w:t>
+      </w:r>
+    </w:p>
+    <w:p>
+      <w:pPr>
+        <w:pStyle w:val="NoSpacing"/>
+        <w:rPr>
+          <w:rFonts w:ascii="Consolas" w:hAnsi="Consolas"/>
+          <w:sz w:val="19"/>
+        </w:rPr>
+      </w:pPr>
+      <w:r>
+        <w:rPr>
+          <w:rFonts w:ascii="Consolas" w:hAnsi="Consolas"/>
+          <w:sz w:val="19"/>
+        </w:rPr>
+        <w:t xml:space="preserve">            // the arithmetic itself.</w:t>
+      </w:r>
+    </w:p>
+    <w:p>
+      <w:pPr>
+        <w:pStyle w:val="NoSpacing"/>
+        <w:rPr>
+          <w:rFonts w:ascii="Consolas" w:hAnsi="Consolas"/>
+          <w:sz w:val="19"/>
+        </w:rPr>
+      </w:pPr>
+      <w:r>
+        <w:rPr>
+          <w:rFonts w:ascii="Consolas" w:hAnsi="Consolas"/>
+          <w:sz w:val="19"/>
+        </w:rPr>
+        <w:t xml:space="preserve">            var executionSettings = new GeminiPromptExecutionSettings</w:t>
+      </w:r>
+    </w:p>
+    <w:p>
+      <w:pPr>
+        <w:pStyle w:val="NoSpacing"/>
+        <w:rPr>
+          <w:rFonts w:ascii="Consolas" w:hAnsi="Consolas"/>
+          <w:sz w:val="19"/>
+        </w:rPr>
+      </w:pPr>
+      <w:r>
+        <w:rPr>
+          <w:rFonts w:ascii="Consolas" w:hAnsi="Consolas"/>
+          <w:sz w:val="19"/>
+        </w:rPr>
+        <w:t xml:space="preserve">            {</w:t>
+      </w:r>
+    </w:p>
+    <w:p>
+      <w:pPr>
+        <w:pStyle w:val="NoSpacing"/>
+        <w:rPr>
+          <w:rFonts w:ascii="Consolas" w:hAnsi="Consolas"/>
+          <w:sz w:val="19"/>
+        </w:rPr>
+      </w:pPr>
+      <w:r>
+        <w:rPr>
+          <w:rFonts w:ascii="Consolas" w:hAnsi="Consolas"/>
+          <w:sz w:val="19"/>
+        </w:rPr>
+        <w:t xml:space="preserve">                ToolCallBehavior = GeminiToolCallBehavior.AutoInvokeKernelFunctions</w:t>
+      </w:r>
+    </w:p>
+    <w:p>
+      <w:pPr>
+        <w:pStyle w:val="NoSpacing"/>
+        <w:rPr>
+          <w:rFonts w:ascii="Consolas" w:hAnsi="Consolas"/>
+          <w:sz w:val="19"/>
+        </w:rPr>
+      </w:pPr>
+      <w:r>
+        <w:rPr>
+          <w:rFonts w:ascii="Consolas" w:hAnsi="Consolas"/>
+          <w:sz w:val="19"/>
+        </w:rPr>
+        <w:t xml:space="preserve">            };</w:t>
+      </w:r>
+    </w:p>
+    <w:p>
+      <w:pPr>
+        <w:pStyle w:val="NoSpacing"/>
+        <w:rPr>
+          <w:rFonts w:ascii="Consolas" w:hAnsi="Consolas"/>
+          <w:sz w:val="19"/>
+        </w:rPr>
+      </w:pPr>
+    </w:p>
+    <w:p>
+      <w:pPr>
+        <w:pStyle w:val="NoSpacing"/>
+        <w:rPr>
+          <w:rFonts w:ascii="Consolas" w:hAnsi="Consolas"/>
+          <w:sz w:val="19"/>
+        </w:rPr>
+      </w:pPr>
+      <w:r>
+        <w:rPr>
+          <w:rFonts w:ascii="Consolas" w:hAnsi="Consolas"/>
+          <w:sz w:val="19"/>
+        </w:rPr>
+        <w:t xml:space="preserve">            var arguments = new KernelArguments(executionSettings);</w:t>
+      </w:r>
+    </w:p>
+    <w:p>
+      <w:pPr>
+        <w:pStyle w:val="NoSpacing"/>
+        <w:rPr>
+          <w:rFonts w:ascii="Consolas" w:hAnsi="Consolas"/>
+          <w:sz w:val="19"/>
+        </w:rPr>
+      </w:pPr>
+      <w:r>
+        <w:rPr>
+          <w:rFonts w:ascii="Consolas" w:hAnsi="Consolas"/>
+          <w:sz w:val="19"/>
+        </w:rPr>
+        <w:t xml:space="preserve">            Console.WriteLine($"Question: {prompt}");</w:t>
+      </w:r>
+    </w:p>
+    <w:p>
+      <w:pPr>
+        <w:pStyle w:val="NoSpacing"/>
+        <w:rPr>
+          <w:rFonts w:ascii="Consolas" w:hAnsi="Consolas"/>
+          <w:sz w:val="19"/>
+        </w:rPr>
+      </w:pPr>
+      <w:r>
+        <w:rPr>
+          <w:rFonts w:ascii="Consolas" w:hAnsi="Consolas"/>
+          <w:sz w:val="19"/>
+        </w:rPr>
+        <w:t xml:space="preserve">            Console.WriteLine("Thinking and invoking C# tools...\n");</w:t>
+      </w:r>
+    </w:p>
+    <w:p>
+      <w:pPr>
+        <w:pStyle w:val="NoSpacing"/>
+        <w:rPr>
+          <w:rFonts w:ascii="Consolas" w:hAnsi="Consolas"/>
+          <w:sz w:val="19"/>
+        </w:rPr>
+      </w:pPr>
+    </w:p>
+    <w:p>
+      <w:pPr>
+        <w:pStyle w:val="NoSpacing"/>
+        <w:rPr>
+          <w:rFonts w:ascii="Consolas" w:hAnsi="Consolas"/>
+          <w:sz w:val="19"/>
+        </w:rPr>
+      </w:pPr>
+      <w:r>
+        <w:rPr>
+          <w:rFonts w:ascii="Consolas" w:hAnsi="Consolas"/>
+          <w:sz w:val="19"/>
+        </w:rPr>
+        <w:t xml:space="preserve">            // Step 6: Run the prompt</w:t>
+      </w:r>
+    </w:p>
+    <w:p>
+      <w:pPr>
+        <w:pStyle w:val="NoSpacing"/>
+        <w:rPr>
+          <w:rFonts w:ascii="Consolas" w:hAnsi="Consolas"/>
+          <w:sz w:val="19"/>
+        </w:rPr>
+      </w:pPr>
+      <w:r>
+        <w:rPr>
+          <w:rFonts w:ascii="Consolas" w:hAnsi="Consolas"/>
+          <w:sz w:val="19"/>
+        </w:rPr>
+        <w:t xml:space="preserve">            var result = await kernel.InvokePromptAsync(prompt, arguments);</w:t>
+      </w:r>
+    </w:p>
+    <w:p>
+      <w:pPr>
+        <w:pStyle w:val="NoSpacing"/>
+        <w:rPr>
+          <w:rFonts w:ascii="Consolas" w:hAnsi="Consolas"/>
+          <w:sz w:val="19"/>
+        </w:rPr>
+      </w:pPr>
+    </w:p>
+    <w:p>
+      <w:pPr>
+        <w:pStyle w:val="NoSpacing"/>
+        <w:rPr>
+          <w:rFonts w:ascii="Consolas" w:hAnsi="Consolas"/>
+          <w:sz w:val="19"/>
+        </w:rPr>
+      </w:pPr>
+      <w:r>
+        <w:rPr>
+          <w:rFonts w:ascii="Consolas" w:hAnsi="Consolas"/>
+          <w:sz w:val="19"/>
+        </w:rPr>
+        <w:t xml:space="preserve">            // Step 7: Display the final result</w:t>
+      </w:r>
+    </w:p>
+    <w:p>
+      <w:pPr>
+        <w:pStyle w:val="NoSpacing"/>
+        <w:rPr>
+          <w:rFonts w:ascii="Consolas" w:hAnsi="Consolas"/>
+          <w:sz w:val="19"/>
+        </w:rPr>
+      </w:pPr>
+      <w:r>
+        <w:rPr>
+          <w:rFonts w:ascii="Consolas" w:hAnsi="Consolas"/>
+          <w:sz w:val="19"/>
+        </w:rPr>
+        <w:t xml:space="preserve">            Console.WriteLine("\n --- AI response ---");</w:t>
+      </w:r>
+    </w:p>
+    <w:p>
+      <w:pPr>
+        <w:pStyle w:val="NoSpacing"/>
+        <w:rPr>
+          <w:rFonts w:ascii="Consolas" w:hAnsi="Consolas"/>
+          <w:sz w:val="19"/>
+        </w:rPr>
+      </w:pPr>
+      <w:r>
+        <w:rPr>
+          <w:rFonts w:ascii="Consolas" w:hAnsi="Consolas"/>
+          <w:sz w:val="19"/>
+        </w:rPr>
+        <w:t xml:space="preserve">            Console.WriteLine(result.ToString().Trim());</w:t>
+      </w:r>
+    </w:p>
+    <w:p>
+      <w:pPr>
+        <w:pStyle w:val="NoSpacing"/>
+        <w:rPr>
+          <w:rFonts w:ascii="Consolas" w:hAnsi="Consolas"/>
+          <w:sz w:val="19"/>
+        </w:rPr>
+      </w:pPr>
+      <w:r>
+        <w:rPr>
+          <w:rFonts w:ascii="Consolas" w:hAnsi="Consolas"/>
+          <w:sz w:val="19"/>
+        </w:rPr>
+        <w:t xml:space="preserve">            Console.WriteLine("-------------------");</w:t>
+      </w:r>
+    </w:p>
+    <w:p>
+      <w:pPr>
+        <w:pStyle w:val="NoSpacing"/>
+        <w:rPr>
+          <w:rFonts w:ascii="Consolas" w:hAnsi="Consolas"/>
+          <w:sz w:val="19"/>
+        </w:rPr>
+      </w:pPr>
+      <w:r>
+        <w:rPr>
+          <w:rFonts w:ascii="Consolas" w:hAnsi="Consolas"/>
+          <w:sz w:val="19"/>
+        </w:rPr>
+        <w:t xml:space="preserve">        }</w:t>
+      </w:r>
+    </w:p>
+    <w:p>
+      <w:pPr>
+        <w:pStyle w:val="NoSpacing"/>
+        <w:rPr>
+          <w:rFonts w:ascii="Consolas" w:hAnsi="Consolas"/>
+          <w:sz w:val="19"/>
+        </w:rPr>
+      </w:pPr>
+    </w:p>
+    <w:p>
+      <w:pPr>
+        <w:pStyle w:val="NoSpacing"/>
+        <w:rPr>
+          <w:rFonts w:ascii="Consolas" w:hAnsi="Consolas"/>
+          <w:sz w:val="19"/>
+        </w:rPr>
+      </w:pPr>
+      <w:r>
+        <w:rPr>
+          <w:rFonts w:ascii="Consolas" w:hAnsi="Consolas"/>
+          <w:sz w:val="19"/>
+        </w:rPr>
+        <w:t xml:space="preserve">    }</w:t>
+      </w:r>
+    </w:p>
+    <w:p>
+      <w:pPr>
+        <w:pStyle w:val="NoSpacing"/>
+        <w:rPr>
+          <w:rFonts w:ascii="Consolas" w:hAnsi="Consolas"/>
+          <w:sz w:val="19"/>
+        </w:rPr>
+      </w:pPr>
+      <w:r>
+        <w:rPr>
+          <w:rFonts w:ascii="Consolas" w:hAnsi="Consolas"/>
+          <w:sz w:val="19"/>
+        </w:rPr>
+        <w:t>}</w:t>
+      </w:r>
+    </w:p>
+    <w:p>
+      <w:pPr>
+        <w:rPr>
+          <w:b/>
+        </w:rPr>
+      </w:pPr>
+      <w:r>
+        <w:rPr>
+          <w:b/>
+        </w:rPr>
+        <w:t>MathPlugin.cs</w:t>
+      </w:r>
+    </w:p>
+    <w:p>
+      <w:pPr>
+        <w:pStyle w:val="NoSpacing"/>
+        <w:rPr>
+          <w:rFonts w:ascii="Consolas" w:hAnsi="Consolas"/>
+          <w:sz w:val="19"/>
+        </w:rPr>
+      </w:pPr>
+      <w:r>
+        <w:rPr>
+          <w:rFonts w:ascii="Consolas" w:hAnsi="Consolas"/>
+          <w:sz w:val="19"/>
+        </w:rPr>
+        <w:t>// MathPlugin</w:t>
+      </w:r>
+    </w:p>
+    <w:p>
+      <w:pPr>
+        <w:pStyle w:val="NoSpacing"/>
+        <w:rPr>
+          <w:rFonts w:ascii="Consolas" w:hAnsi="Consolas"/>
+          <w:sz w:val="19"/>
+        </w:rPr>
+      </w:pPr>
+      <w:r>
+        <w:rPr>
+          <w:rFonts w:ascii="Consolas" w:hAnsi="Consolas"/>
+          <w:sz w:val="19"/>
+        </w:rPr>
+        <w:t>// ---------------------------------------------------------------------------</w:t>
+      </w:r>
+    </w:p>
+    <w:p>
+      <w:pPr>
+        <w:pStyle w:val="NoSpacing"/>
+        <w:rPr>
+          <w:rFonts w:ascii="Consolas" w:hAnsi="Consolas"/>
+          <w:sz w:val="19"/>
+        </w:rPr>
+      </w:pPr>
+      <w:r>
+        <w:rPr>
+          <w:rFonts w:ascii="Consolas" w:hAnsi="Consolas"/>
+          <w:sz w:val="19"/>
+        </w:rPr>
+        <w:t>// A native C# plugin exposing basic arithmetic to the model. The</w:t>
+      </w:r>
+    </w:p>
+    <w:p>
+      <w:pPr>
+        <w:pStyle w:val="NoSpacing"/>
+        <w:rPr>
+          <w:rFonts w:ascii="Consolas" w:hAnsi="Consolas"/>
+          <w:sz w:val="19"/>
+        </w:rPr>
+      </w:pPr>
+      <w:r>
+        <w:rPr>
+          <w:rFonts w:ascii="Consolas" w:hAnsi="Consolas"/>
+          <w:sz w:val="19"/>
+        </w:rPr>
+        <w:t>// [KernelFunction] attribute exposes each method to Semantic Kernel; the</w:t>
+      </w:r>
+    </w:p>
+    <w:p>
+      <w:pPr>
+        <w:pStyle w:val="NoSpacing"/>
+        <w:rPr>
+          <w:rFonts w:ascii="Consolas" w:hAnsi="Consolas"/>
+          <w:sz w:val="19"/>
+        </w:rPr>
+      </w:pPr>
+      <w:r>
+        <w:rPr>
+          <w:rFonts w:ascii="Consolas" w:hAnsi="Consolas"/>
+          <w:sz w:val="19"/>
+        </w:rPr>
+        <w:t>// [Description] attributes are not just documentation for humans - Semantic</w:t>
+      </w:r>
+    </w:p>
+    <w:p>
+      <w:pPr>
+        <w:pStyle w:val="NoSpacing"/>
+        <w:rPr>
+          <w:rFonts w:ascii="Consolas" w:hAnsi="Consolas"/>
+          <w:sz w:val="19"/>
+        </w:rPr>
+      </w:pPr>
+      <w:r>
+        <w:rPr>
+          <w:rFonts w:ascii="Consolas" w:hAnsi="Consolas"/>
+          <w:sz w:val="19"/>
+        </w:rPr>
+        <w:t>// Kernel sends them to the model as a "tool manifest" so it knows which</w:t>
+      </w:r>
+    </w:p>
+    <w:p>
+      <w:pPr>
+        <w:pStyle w:val="NoSpacing"/>
+        <w:rPr>
+          <w:rFonts w:ascii="Consolas" w:hAnsi="Consolas"/>
+          <w:sz w:val="19"/>
+        </w:rPr>
+      </w:pPr>
+      <w:r>
+        <w:rPr>
+          <w:rFonts w:ascii="Consolas" w:hAnsi="Consolas"/>
+          <w:sz w:val="19"/>
+        </w:rPr>
+        <w:t>// function to call and what arguments to pass.</w:t>
       </w:r>
     </w:p>
     <w:p>
@@ -394,22 +1244,6 @@
           <w:rFonts w:ascii="Consolas" w:hAnsi="Consolas"/>
           <w:sz w:val="19"/>
         </w:rPr>
-        <w:t>using Microsoft.SemanticKernel.Connectors.Google;</w:t>
-      </w:r>
-    </w:p>
-    <w:p>
-      <w:pPr>
-        <w:pStyle w:val="NoSpacing"/>
-        <w:rPr>
-          <w:rFonts w:ascii="Consolas" w:hAnsi="Consolas"/>
-          <w:sz w:val="19"/>
-        </w:rPr>
-      </w:pPr>
-      <w:r>
-        <w:rPr>
-          <w:rFonts w:ascii="Consolas" w:hAnsi="Consolas"/>
-          <w:sz w:val="19"/>
-        </w:rPr>
         <w:t>using System.ComponentModel;</w:t>
       </w:r>
     </w:p>
@@ -462,21 +1296,28 @@
           <w:sz w:val="19"/>
         </w:rPr>
       </w:pPr>
-    </w:p>
-    <w:p>
-      <w:pPr>
-        <w:pStyle w:val="NoSpacing"/>
-        <w:rPr>
-          <w:rFonts w:ascii="Consolas" w:hAnsi="Consolas"/>
-          <w:sz w:val="19"/>
-        </w:rPr>
-      </w:pPr>
-      <w:r>
-        <w:rPr>
-          <w:rFonts w:ascii="Consolas" w:hAnsi="Consolas"/>
-          <w:sz w:val="19"/>
-        </w:rPr>
-        <w:t xml:space="preserve">    public class Program</w:t>
+      <w:r>
+        <w:rPr>
+          <w:rFonts w:ascii="Consolas" w:hAnsi="Consolas"/>
+          <w:sz w:val="19"/>
+        </w:rPr>
+        <w:t xml:space="preserve">    // Step 1: Define the Native C# Plugin</w:t>
+      </w:r>
+    </w:p>
+    <w:p>
+      <w:pPr>
+        <w:pStyle w:val="NoSpacing"/>
+        <w:rPr>
+          <w:rFonts w:ascii="Consolas" w:hAnsi="Consolas"/>
+          <w:sz w:val="19"/>
+        </w:rPr>
+      </w:pPr>
+      <w:r>
+        <w:rPr>
+          <w:rFonts w:ascii="Consolas" w:hAnsi="Consolas"/>
+          <w:sz w:val="19"/>
+        </w:rPr>
+        <w:t xml:space="preserve">    public class MathPlugin</w:t>
       </w:r>
     </w:p>
     <w:p>
@@ -508,7 +1349,40 @@
           <w:rFonts w:ascii="Consolas" w:hAnsi="Consolas"/>
           <w:sz w:val="19"/>
         </w:rPr>
-        <w:t xml:space="preserve">        static async Task Main(string[] args)</w:t>
+        <w:lastRenderedPageBreak/>
+        <w:t xml:space="preserve">        [KernelFunction("Add")]</w:t>
+      </w:r>
+    </w:p>
+    <w:p>
+      <w:pPr>
+        <w:pStyle w:val="NoSpacing"/>
+        <w:rPr>
+          <w:rFonts w:ascii="Consolas" w:hAnsi="Consolas"/>
+          <w:sz w:val="19"/>
+        </w:rPr>
+      </w:pPr>
+      <w:r>
+        <w:rPr>
+          <w:rFonts w:ascii="Consolas" w:hAnsi="Consolas"/>
+          <w:sz w:val="19"/>
+        </w:rPr>
+        <w:t xml:space="preserve">        [Description("Adds two numbers together.")]</w:t>
+      </w:r>
+    </w:p>
+    <w:p>
+      <w:pPr>
+        <w:pStyle w:val="NoSpacing"/>
+        <w:rPr>
+          <w:rFonts w:ascii="Consolas" w:hAnsi="Consolas"/>
+          <w:sz w:val="19"/>
+        </w:rPr>
+      </w:pPr>
+      <w:r>
+        <w:rPr>
+          <w:rFonts w:ascii="Consolas" w:hAnsi="Consolas"/>
+          <w:sz w:val="19"/>
+        </w:rPr>
+        <w:t xml:space="preserve">        public double Add([Description("The first number to add")] double number1, [Description("The second number to add")] double number2)</w:t>
       </w:r>
     </w:p>
     <w:p>
@@ -540,1405 +1414,645 @@
           <w:rFonts w:ascii="Consolas" w:hAnsi="Consolas"/>
           <w:sz w:val="19"/>
         </w:rPr>
-        <w:t xml:space="preserve">            // Step 2: Init the kernel</w:t>
-      </w:r>
-    </w:p>
-    <w:p>
-      <w:pPr>
-        <w:pStyle w:val="NoSpacing"/>
-        <w:rPr>
-          <w:rFonts w:ascii="Consolas" w:hAnsi="Consolas"/>
-          <w:sz w:val="19"/>
-        </w:rPr>
-      </w:pPr>
-      <w:r>
-        <w:rPr>
-          <w:rFonts w:ascii="Consolas" w:hAnsi="Consolas"/>
-          <w:sz w:val="19"/>
-        </w:rPr>
-        <w:t xml:space="preserve">            var builder = Kernel.CreateBuilder();</w:t>
-      </w:r>
-    </w:p>
-    <w:p>
-      <w:pPr>
-        <w:pStyle w:val="NoSpacing"/>
-        <w:rPr>
-          <w:rFonts w:ascii="Consolas" w:hAnsi="Consolas"/>
-          <w:sz w:val="19"/>
-        </w:rPr>
-      </w:pPr>
-      <w:r>
-        <w:rPr>
-          <w:rFonts w:ascii="Consolas" w:hAnsi="Consolas"/>
-          <w:sz w:val="19"/>
-        </w:rPr>
-        <w:t xml:space="preserve">            string apiKey = Environment.GetEnvironmentVariable("GEMINI_API_KEY")</w:t>
-      </w:r>
-    </w:p>
-    <w:p>
-      <w:pPr>
-        <w:pStyle w:val="NoSpacing"/>
-        <w:rPr>
-          <w:rFonts w:ascii="Consolas" w:hAnsi="Consolas"/>
-          <w:sz w:val="19"/>
-        </w:rPr>
-      </w:pPr>
-      <w:r>
-        <w:rPr>
-          <w:rFonts w:ascii="Consolas" w:hAnsi="Consolas"/>
-          <w:sz w:val="19"/>
-        </w:rPr>
-        <w:t xml:space="preserve">                ?? throw new Exception("GEMINI_API_KEY environment variable not set");</w:t>
-      </w:r>
-    </w:p>
-    <w:p>
-      <w:pPr>
-        <w:pStyle w:val="NoSpacing"/>
-        <w:rPr>
-          <w:rFonts w:ascii="Consolas" w:hAnsi="Consolas"/>
-          <w:sz w:val="19"/>
-        </w:rPr>
-      </w:pPr>
-      <w:r>
-        <w:rPr>
-          <w:rFonts w:ascii="Consolas" w:hAnsi="Consolas"/>
-          <w:sz w:val="19"/>
-        </w:rPr>
-        <w:t xml:space="preserve">            string modelId = "gemini-2.5-flash";</w:t>
-      </w:r>
-    </w:p>
-    <w:p>
-      <w:pPr>
-        <w:pStyle w:val="NoSpacing"/>
-        <w:rPr>
-          <w:rFonts w:ascii="Consolas" w:hAnsi="Consolas"/>
-          <w:sz w:val="19"/>
-        </w:rPr>
-      </w:pPr>
-    </w:p>
-    <w:p>
-      <w:pPr>
-        <w:pStyle w:val="NoSpacing"/>
-        <w:rPr>
-          <w:rFonts w:ascii="Consolas" w:hAnsi="Consolas"/>
-          <w:sz w:val="19"/>
-        </w:rPr>
-      </w:pPr>
-      <w:r>
-        <w:rPr>
-          <w:rFonts w:ascii="Consolas" w:hAnsi="Consolas"/>
-          <w:sz w:val="19"/>
-        </w:rPr>
-        <w:t xml:space="preserve">            builder.AddGoogleAIGeminiChatCompletion(modelId, apiKey);</w:t>
-      </w:r>
-    </w:p>
-    <w:p>
-      <w:pPr>
-        <w:pStyle w:val="NoSpacing"/>
-        <w:rPr>
-          <w:rFonts w:ascii="Consolas" w:hAnsi="Consolas"/>
-          <w:sz w:val="19"/>
-        </w:rPr>
-      </w:pPr>
-    </w:p>
-    <w:p>
-      <w:pPr>
-        <w:pStyle w:val="NoSpacing"/>
-        <w:rPr>
-          <w:rFonts w:ascii="Consolas" w:hAnsi="Consolas"/>
-          <w:sz w:val="19"/>
-        </w:rPr>
-      </w:pPr>
-      <w:r>
-        <w:rPr>
-          <w:rFonts w:ascii="Consolas" w:hAnsi="Consolas"/>
-          <w:sz w:val="19"/>
-        </w:rPr>
-        <w:t xml:space="preserve">            // Step 3: Load the native plug in</w:t>
-      </w:r>
-    </w:p>
-    <w:p>
-      <w:pPr>
-        <w:pStyle w:val="NoSpacing"/>
-        <w:rPr>
-          <w:rFonts w:ascii="Consolas" w:hAnsi="Consolas"/>
-          <w:sz w:val="19"/>
-        </w:rPr>
-      </w:pPr>
-      <w:r>
-        <w:rPr>
-          <w:rFonts w:ascii="Consolas" w:hAnsi="Consolas"/>
-          <w:sz w:val="19"/>
-        </w:rPr>
-        <w:t xml:space="preserve">            builder.Plugins.AddFromType&lt;MathPlugin&gt;("Math");</w:t>
-      </w:r>
-    </w:p>
-    <w:p>
-      <w:pPr>
-        <w:pStyle w:val="NoSpacing"/>
-        <w:rPr>
-          <w:rFonts w:ascii="Consolas" w:hAnsi="Consolas"/>
-          <w:sz w:val="19"/>
-        </w:rPr>
-      </w:pPr>
-    </w:p>
-    <w:p>
-      <w:pPr>
-        <w:pStyle w:val="NoSpacing"/>
-        <w:rPr>
-          <w:rFonts w:ascii="Consolas" w:hAnsi="Consolas"/>
-          <w:sz w:val="19"/>
-        </w:rPr>
-      </w:pPr>
-      <w:r>
-        <w:rPr>
-          <w:rFonts w:ascii="Consolas" w:hAnsi="Consolas"/>
-          <w:sz w:val="19"/>
-        </w:rPr>
-        <w:t xml:space="preserve">            Kernel kernel = builder.Build();</w:t>
-      </w:r>
-    </w:p>
-    <w:p>
-      <w:pPr>
-        <w:pStyle w:val="NoSpacing"/>
-        <w:rPr>
-          <w:rFonts w:ascii="Consolas" w:hAnsi="Consolas"/>
-          <w:sz w:val="19"/>
-        </w:rPr>
-      </w:pPr>
-    </w:p>
-    <w:p>
-      <w:pPr>
-        <w:pStyle w:val="NoSpacing"/>
-        <w:rPr>
-          <w:rFonts w:ascii="Consolas" w:hAnsi="Consolas"/>
-          <w:sz w:val="19"/>
-        </w:rPr>
-      </w:pPr>
-      <w:r>
-        <w:rPr>
-          <w:rFonts w:ascii="Consolas" w:hAnsi="Consolas"/>
-          <w:sz w:val="19"/>
-        </w:rPr>
-        <w:t xml:space="preserve">            // Step 4: Math word problem</w:t>
-      </w:r>
-    </w:p>
-    <w:p>
-      <w:pPr>
-        <w:pStyle w:val="NoSpacing"/>
-        <w:rPr>
-          <w:rFonts w:ascii="Consolas" w:hAnsi="Consolas"/>
-          <w:sz w:val="19"/>
-        </w:rPr>
-      </w:pPr>
-      <w:r>
-        <w:rPr>
-          <w:rFonts w:ascii="Consolas" w:hAnsi="Consolas"/>
-          <w:sz w:val="19"/>
-        </w:rPr>
-        <w:t xml:space="preserve">            string prompt = "I had 124 apples.  I ate 15 of them.  Then I multiplied the amount of apples I had left by 3.  Finally, I divided all my apples equally among myself and 3 friends.  How many apples did each person get?  Do all math using my tools.  Show yo</w:t>
-      </w:r>
-      <w:r>
-        <w:rPr>
-          <w:rFonts w:ascii="Consolas" w:hAnsi="Consolas"/>
-          <w:sz w:val="19"/>
-        </w:rPr>
+        <w:t xml:space="preserve">            Console.WriteLine($"[NATIVE CODE EXECUTION] Adding {number1} + {number2}");</w:t>
+      </w:r>
+    </w:p>
+    <w:p>
+      <w:pPr>
+        <w:pStyle w:val="NoSpacing"/>
+        <w:rPr>
+          <w:rFonts w:ascii="Consolas" w:hAnsi="Consolas"/>
+          <w:sz w:val="19"/>
+        </w:rPr>
+      </w:pPr>
+      <w:r>
+        <w:rPr>
+          <w:rFonts w:ascii="Consolas" w:hAnsi="Consolas"/>
+          <w:sz w:val="19"/>
+        </w:rPr>
+        <w:t xml:space="preserve">            return number1 + number2;</w:t>
+      </w:r>
+    </w:p>
+    <w:p>
+      <w:pPr>
+        <w:pStyle w:val="NoSpacing"/>
+        <w:rPr>
+          <w:rFonts w:ascii="Consolas" w:hAnsi="Consolas"/>
+          <w:sz w:val="19"/>
+        </w:rPr>
+      </w:pPr>
+      <w:r>
+        <w:rPr>
+          <w:rFonts w:ascii="Consolas" w:hAnsi="Consolas"/>
+          <w:sz w:val="19"/>
+        </w:rPr>
+        <w:t xml:space="preserve">        }</w:t>
+      </w:r>
+    </w:p>
+    <w:p>
+      <w:pPr>
+        <w:pStyle w:val="NoSpacing"/>
+        <w:rPr>
+          <w:rFonts w:ascii="Consolas" w:hAnsi="Consolas"/>
+          <w:sz w:val="19"/>
+        </w:rPr>
+      </w:pPr>
+    </w:p>
+    <w:p>
+      <w:pPr>
+        <w:pStyle w:val="NoSpacing"/>
+        <w:rPr>
+          <w:rFonts w:ascii="Consolas" w:hAnsi="Consolas"/>
+          <w:sz w:val="19"/>
+        </w:rPr>
+      </w:pPr>
+      <w:r>
+        <w:rPr>
+          <w:rFonts w:ascii="Consolas" w:hAnsi="Consolas"/>
+          <w:sz w:val="19"/>
+        </w:rPr>
+        <w:t xml:space="preserve">        [KernelFunction("Subtract")]</w:t>
+      </w:r>
+    </w:p>
+    <w:p>
+      <w:pPr>
+        <w:pStyle w:val="NoSpacing"/>
+        <w:rPr>
+          <w:rFonts w:ascii="Consolas" w:hAnsi="Consolas"/>
+          <w:sz w:val="19"/>
+        </w:rPr>
+      </w:pPr>
+      <w:r>
+        <w:rPr>
+          <w:rFonts w:ascii="Consolas" w:hAnsi="Consolas"/>
+          <w:sz w:val="19"/>
+        </w:rPr>
+        <w:t xml:space="preserve">        [Description("Subtracts the second number from the first number.")]</w:t>
+      </w:r>
+    </w:p>
+    <w:p>
+      <w:pPr>
+        <w:pStyle w:val="NoSpacing"/>
+        <w:rPr>
+          <w:rFonts w:ascii="Consolas" w:hAnsi="Consolas"/>
+          <w:sz w:val="19"/>
+        </w:rPr>
+      </w:pPr>
+      <w:r>
+        <w:rPr>
+          <w:rFonts w:ascii="Consolas" w:hAnsi="Consolas"/>
+          <w:sz w:val="19"/>
+        </w:rPr>
+        <w:t xml:space="preserve">        public double Subtract([Description("The number to subtract from")] double number1, [Description("The number to subtract")] double number2)</w:t>
+      </w:r>
+    </w:p>
+    <w:p>
+      <w:pPr>
+        <w:pStyle w:val="NoSpacing"/>
+        <w:rPr>
+          <w:rFonts w:ascii="Consolas" w:hAnsi="Consolas"/>
+          <w:sz w:val="19"/>
+        </w:rPr>
+      </w:pPr>
+      <w:r>
+        <w:rPr>
+          <w:rFonts w:ascii="Consolas" w:hAnsi="Consolas"/>
+          <w:sz w:val="19"/>
+        </w:rPr>
+        <w:t xml:space="preserve">        {</w:t>
+      </w:r>
+    </w:p>
+    <w:p>
+      <w:pPr>
+        <w:pStyle w:val="NoSpacing"/>
+        <w:rPr>
+          <w:rFonts w:ascii="Consolas" w:hAnsi="Consolas"/>
+          <w:sz w:val="19"/>
+        </w:rPr>
+      </w:pPr>
+      <w:r>
+        <w:rPr>
+          <w:rFonts w:ascii="Consolas" w:hAnsi="Consolas"/>
+          <w:sz w:val="19"/>
+        </w:rPr>
+        <w:t xml:space="preserve">            Console.WriteLine($"[NATIVE CODE EXECUTION] Subtracting {number1} - {number2}");</w:t>
+      </w:r>
+    </w:p>
+    <w:p>
+      <w:pPr>
+        <w:pStyle w:val="NoSpacing"/>
+        <w:rPr>
+          <w:rFonts w:ascii="Consolas" w:hAnsi="Consolas"/>
+          <w:sz w:val="19"/>
+        </w:rPr>
+      </w:pPr>
+      <w:r>
+        <w:rPr>
+          <w:rFonts w:ascii="Consolas" w:hAnsi="Consolas"/>
+          <w:sz w:val="19"/>
+        </w:rPr>
+        <w:t xml:space="preserve">            return number1 - number2;</w:t>
+      </w:r>
+    </w:p>
+    <w:p>
+      <w:pPr>
+        <w:pStyle w:val="NoSpacing"/>
+        <w:rPr>
+          <w:rFonts w:ascii="Consolas" w:hAnsi="Consolas"/>
+          <w:sz w:val="19"/>
+        </w:rPr>
+      </w:pPr>
+      <w:r>
+        <w:rPr>
+          <w:rFonts w:ascii="Consolas" w:hAnsi="Consolas"/>
+          <w:sz w:val="19"/>
+        </w:rPr>
+        <w:t xml:space="preserve">        }</w:t>
+      </w:r>
+    </w:p>
+    <w:p>
+      <w:pPr>
+        <w:pStyle w:val="NoSpacing"/>
+        <w:rPr>
+          <w:rFonts w:ascii="Consolas" w:hAnsi="Consolas"/>
+          <w:sz w:val="19"/>
+        </w:rPr>
+      </w:pPr>
+    </w:p>
+    <w:p>
+      <w:pPr>
+        <w:pStyle w:val="NoSpacing"/>
+        <w:rPr>
+          <w:rFonts w:ascii="Consolas" w:hAnsi="Consolas"/>
+          <w:sz w:val="19"/>
+        </w:rPr>
+      </w:pPr>
+      <w:r>
+        <w:rPr>
+          <w:rFonts w:ascii="Consolas" w:hAnsi="Consolas"/>
+          <w:sz w:val="19"/>
+        </w:rPr>
+        <w:t xml:space="preserve">        [KernelFunction("Multiply")]</w:t>
+      </w:r>
+    </w:p>
+    <w:p>
+      <w:pPr>
+        <w:pStyle w:val="NoSpacing"/>
+        <w:rPr>
+          <w:rFonts w:ascii="Consolas" w:hAnsi="Consolas"/>
+          <w:sz w:val="19"/>
+        </w:rPr>
+      </w:pPr>
+      <w:r>
+        <w:rPr>
+          <w:rFonts w:ascii="Consolas" w:hAnsi="Consolas"/>
+          <w:sz w:val="19"/>
+        </w:rPr>
+        <w:t xml:space="preserve">        [Description("Multiplies two numbers together.")]</w:t>
+      </w:r>
+    </w:p>
+    <w:p>
+      <w:pPr>
+        <w:pStyle w:val="NoSpacing"/>
+        <w:rPr>
+          <w:rFonts w:ascii="Consolas" w:hAnsi="Consolas"/>
+          <w:sz w:val="19"/>
+        </w:rPr>
+      </w:pPr>
+      <w:r>
+        <w:rPr>
+          <w:rFonts w:ascii="Consolas" w:hAnsi="Consolas"/>
+          <w:sz w:val="19"/>
+        </w:rPr>
+        <w:t xml:space="preserve">        public double Multiply([Description("The first number to multiply")] double number1, [Description("The second number to multiply")] double number2)</w:t>
+      </w:r>
+    </w:p>
+    <w:p>
+      <w:pPr>
+        <w:pStyle w:val="NoSpacing"/>
+        <w:rPr>
+          <w:rFonts w:ascii="Consolas" w:hAnsi="Consolas"/>
+          <w:sz w:val="19"/>
+        </w:rPr>
+      </w:pPr>
+      <w:r>
+        <w:rPr>
+          <w:rFonts w:ascii="Consolas" w:hAnsi="Consolas"/>
+          <w:sz w:val="19"/>
+        </w:rPr>
+        <w:t xml:space="preserve">        {</w:t>
+      </w:r>
+    </w:p>
+    <w:p>
+      <w:pPr>
+        <w:pStyle w:val="NoSpacing"/>
+        <w:rPr>
+          <w:rFonts w:ascii="Consolas" w:hAnsi="Consolas"/>
+          <w:sz w:val="19"/>
+        </w:rPr>
+      </w:pPr>
+      <w:r>
+        <w:rPr>
+          <w:rFonts w:ascii="Consolas" w:hAnsi="Consolas"/>
+          <w:sz w:val="19"/>
+        </w:rPr>
+        <w:t xml:space="preserve">            Console.WriteLine($"[NATIVE CODE EXECUTION] Multiplying {number1} * {number2}");</w:t>
+      </w:r>
+    </w:p>
+    <w:p>
+      <w:pPr>
+        <w:pStyle w:val="NoSpacing"/>
+        <w:rPr>
+          <w:rFonts w:ascii="Consolas" w:hAnsi="Consolas"/>
+          <w:sz w:val="19"/>
+        </w:rPr>
+      </w:pPr>
+      <w:r>
+        <w:rPr>
+          <w:rFonts w:ascii="Consolas" w:hAnsi="Consolas"/>
+          <w:sz w:val="19"/>
+        </w:rPr>
+        <w:t xml:space="preserve">            return number1 * number2;</w:t>
+      </w:r>
+    </w:p>
+    <w:p>
+      <w:pPr>
+        <w:pStyle w:val="NoSpacing"/>
+        <w:rPr>
+          <w:rFonts w:ascii="Consolas" w:hAnsi="Consolas"/>
+          <w:sz w:val="19"/>
+        </w:rPr>
+      </w:pPr>
+      <w:r>
+        <w:rPr>
+          <w:rFonts w:ascii="Consolas" w:hAnsi="Consolas"/>
+          <w:sz w:val="19"/>
+        </w:rPr>
+        <w:t xml:space="preserve">        }</w:t>
+      </w:r>
+    </w:p>
+    <w:p>
+      <w:pPr>
+        <w:pStyle w:val="NoSpacing"/>
+        <w:rPr>
+          <w:rFonts w:ascii="Consolas" w:hAnsi="Consolas"/>
+          <w:sz w:val="19"/>
+        </w:rPr>
+      </w:pPr>
+    </w:p>
+    <w:p>
+      <w:pPr>
+        <w:pStyle w:val="NoSpacing"/>
+        <w:rPr>
+          <w:rFonts w:ascii="Consolas" w:hAnsi="Consolas"/>
+          <w:sz w:val="19"/>
+        </w:rPr>
+      </w:pPr>
+      <w:r>
+        <w:rPr>
+          <w:rFonts w:ascii="Consolas" w:hAnsi="Consolas"/>
+          <w:sz w:val="19"/>
+        </w:rPr>
+        <w:t xml:space="preserve">        [KernelFunction("Divide")]</w:t>
+      </w:r>
+    </w:p>
+    <w:p>
+      <w:pPr>
+        <w:pStyle w:val="NoSpacing"/>
+        <w:rPr>
+          <w:rFonts w:ascii="Consolas" w:hAnsi="Consolas"/>
+          <w:sz w:val="19"/>
+        </w:rPr>
+      </w:pPr>
+      <w:r>
+        <w:rPr>
+          <w:rFonts w:ascii="Consolas" w:hAnsi="Consolas"/>
+          <w:sz w:val="19"/>
+        </w:rPr>
+        <w:t xml:space="preserve">        [Description("Divides the first number by the second number.")]</w:t>
+      </w:r>
+    </w:p>
+    <w:p>
+      <w:pPr>
+        <w:pStyle w:val="NoSpacing"/>
+        <w:rPr>
+          <w:rFonts w:ascii="Consolas" w:hAnsi="Consolas"/>
+          <w:sz w:val="19"/>
+        </w:rPr>
+      </w:pPr>
+      <w:r>
+        <w:rPr>
+          <w:rFonts w:ascii="Consolas" w:hAnsi="Consolas"/>
+          <w:sz w:val="19"/>
+        </w:rPr>
+        <w:t xml:space="preserve">        public double Divide([Description("The number to divide")] double number1, [Description("The number to divide by")] double number2)</w:t>
+      </w:r>
+    </w:p>
+    <w:p>
+      <w:pPr>
+        <w:pStyle w:val="NoSpacing"/>
+        <w:rPr>
+          <w:rFonts w:ascii="Consolas" w:hAnsi="Consolas"/>
+          <w:sz w:val="19"/>
+        </w:rPr>
+      </w:pPr>
+      <w:r>
+        <w:rPr>
+          <w:rFonts w:ascii="Consolas" w:hAnsi="Consolas"/>
+          <w:sz w:val="19"/>
+        </w:rPr>
+        <w:t xml:space="preserve">        {</w:t>
+      </w:r>
+    </w:p>
+    <w:p>
+      <w:pPr>
+        <w:pStyle w:val="NoSpacing"/>
+        <w:rPr>
+          <w:rFonts w:ascii="Consolas" w:hAnsi="Consolas"/>
+          <w:sz w:val="19"/>
+        </w:rPr>
+      </w:pPr>
+      <w:r>
+        <w:rPr>
+          <w:rFonts w:ascii="Consolas" w:hAnsi="Consolas"/>
+          <w:sz w:val="19"/>
+        </w:rPr>
+        <w:t xml:space="preserve">            // Guard: double division by zero </w:t>
+      </w:r>
+      <w:r>
+        <w:rPr>
+          <w:rFonts w:ascii="Consolas" w:hAnsi="Consolas"/>
+          <w:sz w:val="19"/>
+        </w:rPr>
+        <w:t>doesn't throw</w:t>
+      </w:r>
+      <w:r>
+        <w:rPr>
+          <w:rFonts w:ascii="Consolas" w:hAnsi="Consolas"/>
+          <w:sz w:val="19"/>
+        </w:rPr>
+        <w:t>, it silently returns</w:t>
+      </w:r>
+    </w:p>
+    <w:p>
+      <w:pPr>
+        <w:pStyle w:val="NoSpacing"/>
+        <w:rPr>
+          <w:rFonts w:ascii="Consolas" w:hAnsi="Consolas"/>
+          <w:sz w:val="19"/>
+        </w:rPr>
+      </w:pPr>
+      <w:r>
+        <w:rPr>
+          <w:rFonts w:ascii="Consolas" w:hAnsi="Consolas"/>
+          <w:sz w:val="19"/>
+        </w:rPr>
+        <w:t xml:space="preserve">            // Infinity/NaN. Throw a descriptive exception instead so Semantic</w:t>
+      </w:r>
+    </w:p>
+    <w:p>
+      <w:pPr>
+        <w:pStyle w:val="NoSpacing"/>
+        <w:rPr>
+          <w:rFonts w:ascii="Consolas" w:hAnsi="Consolas"/>
+          <w:sz w:val="19"/>
+        </w:rPr>
+      </w:pPr>
+      <w:r>
+        <w:rPr>
+          <w:rFonts w:ascii="Consolas" w:hAnsi="Consolas"/>
+          <w:sz w:val="19"/>
+        </w:rPr>
+        <w:t xml:space="preserve">            // Kernel can surface a real tool error back to the model.</w:t>
+      </w:r>
+    </w:p>
+    <w:p>
+      <w:pPr>
+        <w:pStyle w:val="NoSpacing"/>
+        <w:rPr>
+          <w:rFonts w:ascii="Consolas" w:hAnsi="Consolas"/>
+          <w:sz w:val="19"/>
+        </w:rPr>
+      </w:pPr>
+      <w:r>
+        <w:rPr>
+          <w:rFonts w:ascii="Consolas" w:hAnsi="Consolas"/>
+          <w:sz w:val="19"/>
+        </w:rPr>
+        <w:t xml:space="preserve">            if (number2 == 0)</w:t>
+      </w:r>
+    </w:p>
+    <w:p>
+      <w:pPr>
+        <w:pStyle w:val="NoSpacing"/>
+        <w:rPr>
+          <w:rFonts w:ascii="Consolas" w:hAnsi="Consolas"/>
+          <w:sz w:val="19"/>
+        </w:rPr>
+      </w:pPr>
+      <w:r>
+        <w:rPr>
+          <w:rFonts w:ascii="Consolas" w:hAnsi="Consolas"/>
+          <w:sz w:val="19"/>
+        </w:rPr>
+        <w:t xml:space="preserve">            {</w:t>
+      </w:r>
+    </w:p>
+    <w:p>
+      <w:pPr>
+        <w:pStyle w:val="NoSpacing"/>
+        <w:rPr>
+          <w:rFonts w:ascii="Consolas" w:hAnsi="Consolas"/>
+          <w:sz w:val="19"/>
+        </w:rPr>
+      </w:pPr>
+      <w:r>
+        <w:rPr>
+          <w:rFonts w:ascii="Consolas" w:hAnsi="Consolas"/>
+          <w:sz w:val="19"/>
+        </w:rPr>
+        <w:t xml:space="preserve">                throw new DivideByZeroException("Cannot divide by zero.");</w:t>
+      </w:r>
+    </w:p>
+    <w:p>
+      <w:pPr>
+        <w:pStyle w:val="NoSpacing"/>
+        <w:rPr>
+          <w:rFonts w:ascii="Consolas" w:hAnsi="Consolas"/>
+          <w:sz w:val="19"/>
+        </w:rPr>
+      </w:pPr>
+      <w:r>
+        <w:rPr>
+          <w:rFonts w:ascii="Consolas" w:hAnsi="Consolas"/>
+          <w:sz w:val="19"/>
+        </w:rPr>
+        <w:t xml:space="preserve">            }</w:t>
+      </w:r>
+    </w:p>
+    <w:p>
+      <w:pPr>
+        <w:pStyle w:val="NoSpacing"/>
+        <w:rPr>
+          <w:rFonts w:ascii="Consolas" w:hAnsi="Consolas"/>
+          <w:sz w:val="19"/>
+        </w:rPr>
+      </w:pPr>
+    </w:p>
+    <w:p>
+      <w:pPr>
+        <w:pStyle w:val="NoSpacing"/>
+        <w:rPr>
+          <w:rFonts w:ascii="Consolas" w:hAnsi="Consolas"/>
+          <w:sz w:val="19"/>
+        </w:rPr>
+      </w:pPr>
+      <w:r>
+        <w:rPr>
+          <w:rFonts w:ascii="Consolas" w:hAnsi="Consolas"/>
+          <w:sz w:val="19"/>
+        </w:rPr>
+        <w:t xml:space="preserve">            Console.WriteLine($"[NATIVE CODE EXECUTION] Dividing {number1} / {number2}");</w:t>
+      </w:r>
+    </w:p>
+    <w:p>
+      <w:pPr>
+        <w:pStyle w:val="NoSpacing"/>
+        <w:rPr>
+          <w:rFonts w:ascii="Consolas" w:hAnsi="Consolas"/>
+          <w:sz w:val="19"/>
+        </w:rPr>
+      </w:pPr>
+      <w:r>
+        <w:rPr>
+          <w:rFonts w:ascii="Consolas" w:hAnsi="Consolas"/>
+          <w:sz w:val="19"/>
+        </w:rPr>
+        <w:t xml:space="preserve">            return number1 / number2;</w:t>
+      </w:r>
+    </w:p>
+    <w:p>
+      <w:pPr>
+        <w:pStyle w:val="NoSpacing"/>
+        <w:rPr>
+          <w:rFonts w:ascii="Consolas" w:hAnsi="Consolas"/>
+          <w:sz w:val="19"/>
+        </w:rPr>
+      </w:pPr>
+      <w:r>
+        <w:rPr>
+          <w:rFonts w:ascii="Consolas" w:hAnsi="Consolas"/>
+          <w:sz w:val="19"/>
+        </w:rPr>
+        <w:t xml:space="preserve">        }</w:t>
+      </w:r>
+    </w:p>
+    <w:p>
+      <w:pPr>
+        <w:pStyle w:val="NoSpacing"/>
+        <w:rPr>
+          <w:rFonts w:ascii="Consolas" w:hAnsi="Consolas"/>
+          <w:sz w:val="19"/>
+        </w:rPr>
+      </w:pPr>
+      <w:r>
+        <w:rPr>
+          <w:rFonts w:ascii="Consolas" w:hAnsi="Consolas"/>
+          <w:sz w:val="19"/>
+        </w:rPr>
+        <w:t xml:space="preserve">    }</w:t>
+      </w:r>
+    </w:p>
+    <w:p>
+      <w:pPr>
+        <w:pStyle w:val="NoSpacing"/>
+        <w:rPr>
+          <w:rFonts w:ascii="Consolas" w:hAnsi="Consolas"/>
+          <w:sz w:val="19"/>
+        </w:rPr>
+      </w:pPr>
+      <w:r>
+        <w:rPr>
+          <w:rFonts w:ascii="Consolas" w:hAnsi="Consolas"/>
+          <w:sz w:val="19"/>
+        </w:rPr>
+        <w:t>}</w:t>
+      </w:r>
+    </w:p>
+    <w:p/>
+    <w:p>
+      <w:pPr>
+        <w:pStyle w:val="Heading2"/>
+      </w:pPr>
+      <w:r>
+        <w:t>5. Code Walkthrough &amp; Explanations</w:t>
+      </w:r>
+    </w:p>
+    <w:p>
+      <w:r>
+        <w:rPr>
+          <w:b/>
+        </w:rPr>
+        <w:t>Step 1: Writing the Native Plugin and its Attributes (MathPlugin.cs).</w:t>
+      </w:r>
+      <w:r>
+        <w:t xml:space="preserve"> `MathPlugin` is a plain C# class with four ordinary-looking methods: `Add`, `Subtract`, `Multiply`, and `Divide`. What turns them into AI-callable "tools" is the attributes stacked above each method. `[KernelFunction("Add")]` tells Semantic Kernel "expose this method, and call it `Add` in the tool manifest." The `[Description("...")]` attributes — on the method itself and </w:t>
+      </w:r>
+      <w:r>
         <w:lastRenderedPageBreak/>
-        <w:t>ur work step by step.";</w:t>
-      </w:r>
-    </w:p>
-    <w:p>
-      <w:pPr>
-        <w:pStyle w:val="NoSpacing"/>
-        <w:rPr>
-          <w:rFonts w:ascii="Consolas" w:hAnsi="Consolas"/>
-          <w:sz w:val="19"/>
-        </w:rPr>
-      </w:pPr>
-    </w:p>
-    <w:p>
-      <w:pPr>
-        <w:pStyle w:val="NoSpacing"/>
-        <w:rPr>
-          <w:rFonts w:ascii="Consolas" w:hAnsi="Consolas"/>
-          <w:sz w:val="19"/>
-        </w:rPr>
-      </w:pPr>
-      <w:r>
-        <w:rPr>
-          <w:rFonts w:ascii="Consolas" w:hAnsi="Consolas"/>
-          <w:sz w:val="19"/>
-        </w:rPr>
-        <w:t xml:space="preserve">            // Step 5: Enable Auto-Invocation of the tools. Without this, the</w:t>
-      </w:r>
-    </w:p>
-    <w:p>
-      <w:pPr>
-        <w:pStyle w:val="NoSpacing"/>
-        <w:rPr>
-          <w:rFonts w:ascii="Consolas" w:hAnsi="Consolas"/>
-          <w:sz w:val="19"/>
-        </w:rPr>
-      </w:pPr>
-      <w:r>
-        <w:rPr>
-          <w:rFonts w:ascii="Consolas" w:hAnsi="Consolas"/>
-          <w:sz w:val="19"/>
-        </w:rPr>
-        <w:t xml:space="preserve">            // model would know the Math plugin exists but wouldn't have</w:t>
-      </w:r>
-    </w:p>
-    <w:p>
-      <w:pPr>
-        <w:pStyle w:val="NoSpacing"/>
-        <w:rPr>
-          <w:rFonts w:ascii="Consolas" w:hAnsi="Consolas"/>
-          <w:sz w:val="19"/>
-        </w:rPr>
-      </w:pPr>
-      <w:r>
-        <w:rPr>
-          <w:rFonts w:ascii="Consolas" w:hAnsi="Consolas"/>
-          <w:sz w:val="19"/>
-        </w:rPr>
-        <w:t xml:space="preserve">            // permission to call it - it would just try (and fail) to guess</w:t>
-      </w:r>
-    </w:p>
-    <w:p>
-      <w:pPr>
-        <w:pStyle w:val="NoSpacing"/>
-        <w:rPr>
-          <w:rFonts w:ascii="Consolas" w:hAnsi="Consolas"/>
-          <w:sz w:val="19"/>
-        </w:rPr>
-      </w:pPr>
-      <w:r>
-        <w:rPr>
-          <w:rFonts w:ascii="Consolas" w:hAnsi="Consolas"/>
-          <w:sz w:val="19"/>
-        </w:rPr>
-        <w:t xml:space="preserve">            // the arithmetic itself.</w:t>
-      </w:r>
-    </w:p>
-    <w:p>
-      <w:pPr>
-        <w:pStyle w:val="NoSpacing"/>
-        <w:rPr>
-          <w:rFonts w:ascii="Consolas" w:hAnsi="Consolas"/>
-          <w:sz w:val="19"/>
-        </w:rPr>
-      </w:pPr>
-      <w:r>
-        <w:rPr>
-          <w:rFonts w:ascii="Consolas" w:hAnsi="Consolas"/>
-          <w:sz w:val="19"/>
-        </w:rPr>
-        <w:t xml:space="preserve">            var executionSettings = new GeminiPromptExecutionSettings</w:t>
-      </w:r>
-    </w:p>
-    <w:p>
-      <w:pPr>
-        <w:pStyle w:val="NoSpacing"/>
-        <w:rPr>
-          <w:rFonts w:ascii="Consolas" w:hAnsi="Consolas"/>
-          <w:sz w:val="19"/>
-        </w:rPr>
-      </w:pPr>
-      <w:r>
-        <w:rPr>
-          <w:rFonts w:ascii="Consolas" w:hAnsi="Consolas"/>
-          <w:sz w:val="19"/>
-        </w:rPr>
-        <w:t xml:space="preserve">            {</w:t>
-      </w:r>
-    </w:p>
-    <w:p>
-      <w:pPr>
-        <w:pStyle w:val="NoSpacing"/>
-        <w:rPr>
-          <w:rFonts w:ascii="Consolas" w:hAnsi="Consolas"/>
-          <w:sz w:val="19"/>
-        </w:rPr>
-      </w:pPr>
-      <w:r>
-        <w:rPr>
-          <w:rFonts w:ascii="Consolas" w:hAnsi="Consolas"/>
-          <w:sz w:val="19"/>
-        </w:rPr>
-        <w:t xml:space="preserve">                ToolCallBehavior = GeminiToolCallBehavior.AutoInvokeKernelFunctions</w:t>
-      </w:r>
-    </w:p>
-    <w:p>
-      <w:pPr>
-        <w:pStyle w:val="NoSpacing"/>
-        <w:rPr>
-          <w:rFonts w:ascii="Consolas" w:hAnsi="Consolas"/>
-          <w:sz w:val="19"/>
-        </w:rPr>
-      </w:pPr>
-      <w:r>
-        <w:rPr>
-          <w:rFonts w:ascii="Consolas" w:hAnsi="Consolas"/>
-          <w:sz w:val="19"/>
-        </w:rPr>
-        <w:t xml:space="preserve">            };</w:t>
-      </w:r>
-    </w:p>
-    <w:p>
-      <w:pPr>
-        <w:pStyle w:val="NoSpacing"/>
-        <w:rPr>
-          <w:rFonts w:ascii="Consolas" w:hAnsi="Consolas"/>
-          <w:sz w:val="19"/>
-        </w:rPr>
-      </w:pPr>
-    </w:p>
-    <w:p>
-      <w:pPr>
-        <w:pStyle w:val="NoSpacing"/>
-        <w:rPr>
-          <w:rFonts w:ascii="Consolas" w:hAnsi="Consolas"/>
-          <w:sz w:val="19"/>
-        </w:rPr>
-      </w:pPr>
-      <w:r>
-        <w:rPr>
-          <w:rFonts w:ascii="Consolas" w:hAnsi="Consolas"/>
-          <w:sz w:val="19"/>
-        </w:rPr>
-        <w:t xml:space="preserve">            var arguments = new KernelArguments(executionSettings);</w:t>
-      </w:r>
-    </w:p>
-    <w:p>
-      <w:pPr>
-        <w:pStyle w:val="NoSpacing"/>
-        <w:rPr>
-          <w:rFonts w:ascii="Consolas" w:hAnsi="Consolas"/>
-          <w:sz w:val="19"/>
-        </w:rPr>
-      </w:pPr>
-      <w:r>
-        <w:rPr>
-          <w:rFonts w:ascii="Consolas" w:hAnsi="Consolas"/>
-          <w:sz w:val="19"/>
-        </w:rPr>
-        <w:t xml:space="preserve">            Console.WriteLine($"Question: {prompt}");</w:t>
-      </w:r>
-    </w:p>
-    <w:p>
-      <w:pPr>
-        <w:pStyle w:val="NoSpacing"/>
-        <w:rPr>
-          <w:rFonts w:ascii="Consolas" w:hAnsi="Consolas"/>
-          <w:sz w:val="19"/>
-        </w:rPr>
-      </w:pPr>
-      <w:r>
-        <w:rPr>
-          <w:rFonts w:ascii="Consolas" w:hAnsi="Consolas"/>
-          <w:sz w:val="19"/>
-        </w:rPr>
-        <w:t xml:space="preserve">            Console.WriteLine("Thinking and invoking C# tools...\n");</w:t>
-      </w:r>
-    </w:p>
-    <w:p>
-      <w:pPr>
-        <w:pStyle w:val="NoSpacing"/>
-        <w:rPr>
-          <w:rFonts w:ascii="Consolas" w:hAnsi="Consolas"/>
-          <w:sz w:val="19"/>
-        </w:rPr>
-      </w:pPr>
-    </w:p>
-    <w:p>
-      <w:pPr>
-        <w:pStyle w:val="NoSpacing"/>
-        <w:rPr>
-          <w:rFonts w:ascii="Consolas" w:hAnsi="Consolas"/>
-          <w:sz w:val="19"/>
-        </w:rPr>
-      </w:pPr>
-      <w:r>
-        <w:rPr>
-          <w:rFonts w:ascii="Consolas" w:hAnsi="Consolas"/>
-          <w:sz w:val="19"/>
-        </w:rPr>
-        <w:t xml:space="preserve">            // Step 6: Run the prompt</w:t>
-      </w:r>
-    </w:p>
-    <w:p>
-      <w:pPr>
-        <w:pStyle w:val="NoSpacing"/>
-        <w:rPr>
-          <w:rFonts w:ascii="Consolas" w:hAnsi="Consolas"/>
-          <w:sz w:val="19"/>
-        </w:rPr>
-      </w:pPr>
-      <w:r>
-        <w:rPr>
-          <w:rFonts w:ascii="Consolas" w:hAnsi="Consolas"/>
-          <w:sz w:val="19"/>
-        </w:rPr>
-        <w:t xml:space="preserve">            var result = await kernel.InvokePromptAsync(prompt, arguments);</w:t>
-      </w:r>
-    </w:p>
-    <w:p>
-      <w:pPr>
-        <w:pStyle w:val="NoSpacing"/>
-        <w:rPr>
-          <w:rFonts w:ascii="Consolas" w:hAnsi="Consolas"/>
-          <w:sz w:val="19"/>
-        </w:rPr>
-      </w:pPr>
-    </w:p>
-    <w:p>
-      <w:pPr>
-        <w:pStyle w:val="NoSpacing"/>
-        <w:rPr>
-          <w:rFonts w:ascii="Consolas" w:hAnsi="Consolas"/>
-          <w:sz w:val="19"/>
-        </w:rPr>
-      </w:pPr>
-      <w:r>
-        <w:rPr>
-          <w:rFonts w:ascii="Consolas" w:hAnsi="Consolas"/>
-          <w:sz w:val="19"/>
-        </w:rPr>
-        <w:t xml:space="preserve">            // Step 7: Display the final result</w:t>
-      </w:r>
-    </w:p>
-    <w:p>
-      <w:pPr>
-        <w:pStyle w:val="NoSpacing"/>
-        <w:rPr>
-          <w:rFonts w:ascii="Consolas" w:hAnsi="Consolas"/>
-          <w:sz w:val="19"/>
-        </w:rPr>
-      </w:pPr>
-      <w:r>
-        <w:rPr>
-          <w:rFonts w:ascii="Consolas" w:hAnsi="Consolas"/>
-          <w:sz w:val="19"/>
-        </w:rPr>
-        <w:t xml:space="preserve">            Console.WriteLine("\n --- AI response ---");</w:t>
-      </w:r>
-    </w:p>
-    <w:p>
-      <w:pPr>
-        <w:pStyle w:val="NoSpacing"/>
-        <w:rPr>
-          <w:rFonts w:ascii="Consolas" w:hAnsi="Consolas"/>
-          <w:sz w:val="19"/>
-        </w:rPr>
-      </w:pPr>
-      <w:r>
-        <w:rPr>
-          <w:rFonts w:ascii="Consolas" w:hAnsi="Consolas"/>
-          <w:sz w:val="19"/>
-        </w:rPr>
-        <w:t xml:space="preserve">            Console.WriteLine(result.ToString().Trim());</w:t>
-      </w:r>
-    </w:p>
-    <w:p>
-      <w:pPr>
-        <w:pStyle w:val="NoSpacing"/>
-        <w:rPr>
-          <w:rFonts w:ascii="Consolas" w:hAnsi="Consolas"/>
-          <w:sz w:val="19"/>
-        </w:rPr>
-      </w:pPr>
-      <w:r>
-        <w:rPr>
-          <w:rFonts w:ascii="Consolas" w:hAnsi="Consolas"/>
-          <w:sz w:val="19"/>
-        </w:rPr>
-        <w:t xml:space="preserve">            Console.WriteLine("-------------------");</w:t>
-      </w:r>
-    </w:p>
-    <w:p>
-      <w:pPr>
-        <w:pStyle w:val="NoSpacing"/>
-        <w:rPr>
-          <w:rFonts w:ascii="Consolas" w:hAnsi="Consolas"/>
-          <w:sz w:val="19"/>
-        </w:rPr>
-      </w:pPr>
-      <w:r>
-        <w:rPr>
-          <w:rFonts w:ascii="Consolas" w:hAnsi="Consolas"/>
-          <w:sz w:val="19"/>
-        </w:rPr>
-        <w:t xml:space="preserve">        }</w:t>
-      </w:r>
-    </w:p>
-    <w:p>
-      <w:pPr>
-        <w:pStyle w:val="NoSpacing"/>
-        <w:rPr>
-          <w:rFonts w:ascii="Consolas" w:hAnsi="Consolas"/>
-          <w:sz w:val="19"/>
-        </w:rPr>
-      </w:pPr>
-    </w:p>
-    <w:p>
-      <w:pPr>
-        <w:pStyle w:val="NoSpacing"/>
-        <w:rPr>
-          <w:rFonts w:ascii="Consolas" w:hAnsi="Consolas"/>
-          <w:sz w:val="19"/>
-        </w:rPr>
-      </w:pPr>
-      <w:r>
-        <w:rPr>
-          <w:rFonts w:ascii="Consolas" w:hAnsi="Consolas"/>
-          <w:sz w:val="19"/>
-        </w:rPr>
-        <w:t xml:space="preserve">    }</w:t>
-      </w:r>
-    </w:p>
-    <w:p>
-      <w:pPr>
-        <w:pStyle w:val="NoSpacing"/>
-        <w:rPr>
-          <w:rFonts w:ascii="Consolas" w:hAnsi="Consolas"/>
-          <w:sz w:val="19"/>
-        </w:rPr>
-      </w:pPr>
-      <w:r>
-        <w:rPr>
-          <w:rFonts w:ascii="Consolas" w:hAnsi="Consolas"/>
-          <w:sz w:val="19"/>
-        </w:rPr>
-        <w:t>}</w:t>
-      </w:r>
-    </w:p>
-    <w:p>
-      <w:pPr>
+        <w:t>on every single parameter — are not just for human readers browsing the code. Semantic Kernel serializes these description strings and sends them to Gemini as part of the request. The model reads "Adds two numbers together" and "The first number to add" to decide, purely from natural language, which function matches its current need and which value goes into which parameter.</w:t>
+      </w:r>
+    </w:p>
+    <w:p/>
+    <w:p>
+      <w:r>
         <w:rPr>
           <w:b/>
         </w:rPr>
-      </w:pPr>
+        <w:t>Steps 2 &amp; 3: Kernel Setup and Plugin Registration (Program.cs).</w:t>
+      </w:r>
+      <w:r>
+        <w:t xml:space="preserve"> The kernel builder pattern is identical to every previous lesson. The new line is `builder.Plugins.AddFromType&lt;MathPlugin&gt;("Math")`, which happens *before* `builder.Build()`. This registers the plugin under the name `"Math"`, so its functions become addressable as `Math.Add`, `Math.Subtract`, `Math.Multiply`, and `Math.Divide` inside the model's tool-calling system.</w:t>
+      </w:r>
+    </w:p>
+    <w:p/>
+    <w:p>
       <w:r>
         <w:rPr>
           <w:b/>
         </w:rPr>
-        <w:t>MathPlugin.cs</w:t>
-      </w:r>
-    </w:p>
-    <w:p>
-      <w:pPr>
-        <w:pStyle w:val="NoSpacing"/>
-        <w:rPr>
-          <w:rFonts w:ascii="Consolas" w:hAnsi="Consolas"/>
-          <w:sz w:val="19"/>
-        </w:rPr>
-      </w:pPr>
-      <w:r>
-        <w:rPr>
-          <w:rFonts w:ascii="Consolas" w:hAnsi="Consolas"/>
-          <w:sz w:val="19"/>
-        </w:rPr>
-        <w:t>// MathPlugin</w:t>
-      </w:r>
-    </w:p>
-    <w:p>
-      <w:pPr>
-        <w:pStyle w:val="NoSpacing"/>
-        <w:rPr>
-          <w:rFonts w:ascii="Consolas" w:hAnsi="Consolas"/>
-          <w:sz w:val="19"/>
-        </w:rPr>
-      </w:pPr>
-      <w:r>
-        <w:rPr>
-          <w:rFonts w:ascii="Consolas" w:hAnsi="Consolas"/>
-          <w:sz w:val="19"/>
-        </w:rPr>
-        <w:t>// ---------------------------------------------------------------------------</w:t>
-      </w:r>
-    </w:p>
-    <w:p>
-      <w:pPr>
-        <w:pStyle w:val="NoSpacing"/>
-        <w:rPr>
-          <w:rFonts w:ascii="Consolas" w:hAnsi="Consolas"/>
-          <w:sz w:val="19"/>
-        </w:rPr>
-      </w:pPr>
-      <w:r>
-        <w:rPr>
-          <w:rFonts w:ascii="Consolas" w:hAnsi="Consolas"/>
-          <w:sz w:val="19"/>
-        </w:rPr>
-        <w:t>// A native C# plugin exposing basic arithmetic to the model. The</w:t>
-      </w:r>
-    </w:p>
-    <w:p>
-      <w:pPr>
-        <w:pStyle w:val="NoSpacing"/>
-        <w:rPr>
-          <w:rFonts w:ascii="Consolas" w:hAnsi="Consolas"/>
-          <w:sz w:val="19"/>
-        </w:rPr>
-      </w:pPr>
-      <w:r>
-        <w:rPr>
-          <w:rFonts w:ascii="Consolas" w:hAnsi="Consolas"/>
-          <w:sz w:val="19"/>
-        </w:rPr>
-        <w:t>// [KernelFunction] attribute exposes each method to Semantic Kernel; the</w:t>
-      </w:r>
-    </w:p>
-    <w:p>
-      <w:pPr>
-        <w:pStyle w:val="NoSpacing"/>
-        <w:rPr>
-          <w:rFonts w:ascii="Consolas" w:hAnsi="Consolas"/>
-          <w:sz w:val="19"/>
-        </w:rPr>
-      </w:pPr>
-      <w:r>
-        <w:rPr>
-          <w:rFonts w:ascii="Consolas" w:hAnsi="Consolas"/>
-          <w:sz w:val="19"/>
-        </w:rPr>
-        <w:t>// [Description] attributes are not just documentation for humans - Semantic</w:t>
-      </w:r>
-    </w:p>
-    <w:p>
-      <w:pPr>
-        <w:pStyle w:val="NoSpacing"/>
-        <w:rPr>
-          <w:rFonts w:ascii="Consolas" w:hAnsi="Consolas"/>
-          <w:sz w:val="19"/>
-        </w:rPr>
-      </w:pPr>
-      <w:r>
-        <w:rPr>
-          <w:rFonts w:ascii="Consolas" w:hAnsi="Consolas"/>
-          <w:sz w:val="19"/>
-        </w:rPr>
-        <w:t>// Kernel sends them to the model as a "tool manifest" so it knows which</w:t>
-      </w:r>
-    </w:p>
-    <w:p>
-      <w:pPr>
-        <w:pStyle w:val="NoSpacing"/>
-        <w:rPr>
-          <w:rFonts w:ascii="Consolas" w:hAnsi="Consolas"/>
-          <w:sz w:val="19"/>
-        </w:rPr>
-      </w:pPr>
-      <w:r>
-        <w:rPr>
-          <w:rFonts w:ascii="Consolas" w:hAnsi="Consolas"/>
-          <w:sz w:val="19"/>
-        </w:rPr>
-        <w:t>// function to call and what arguments to pass.</w:t>
-      </w:r>
-    </w:p>
-    <w:p>
-      <w:pPr>
-        <w:pStyle w:val="NoSpacing"/>
-        <w:rPr>
-          <w:rFonts w:ascii="Consolas" w:hAnsi="Consolas"/>
-          <w:sz w:val="19"/>
-        </w:rPr>
-      </w:pPr>
-      <w:r>
-        <w:rPr>
-          <w:rFonts w:ascii="Consolas" w:hAnsi="Consolas"/>
-          <w:sz w:val="19"/>
-        </w:rPr>
-        <w:t>using Microsoft.Sema</w:t>
-      </w:r>
-      <w:r>
-        <w:rPr>
-          <w:rFonts w:ascii="Consolas" w:hAnsi="Consolas"/>
-          <w:sz w:val="19"/>
-        </w:rPr>
+        <w:t>Step 4: The Math Word Problem.</w:t>
+      </w:r>
+      <w:r>
+        <w:t xml:space="preserve"> The prompt is deliberately a chained, multi-step problem (subtract, then multiply, then divide) rather than a single calculation. This is intentional: it forces the model to plan a sequence of tool calls rather than making just one, which is exactly the multi-step reasoning pattern that later multi-agent lessons in this course build on.</w:t>
+      </w:r>
+    </w:p>
+    <w:p/>
+    <w:p>
+      <w:r>
+        <w:rPr>
+          <w:b/>
+        </w:rPr>
+        <w:t>Step 5: Enabling Auto-Invocation.</w:t>
+      </w:r>
+      <w:r>
+        <w:t xml:space="preserve"> This is the most important line in the lesson: `ToolCallBehavior = GeminiToolCallBehavior.AutoInvokeKernelFunctions`. Registering a plugin only makes the model *aware* the tools exist; without this setting, the model would still try to guess the arithmetic itself using its language-modeling instincts (and likely get the multi-step problem wrong). With auto-invocation enabled, Semantic Kernel is authorized to actually execute the native C# method whenever the model requests it, and to feed the exact numeric result back into the model's context automatically.</w:t>
+      </w:r>
+    </w:p>
+    <w:p/>
+    <w:p>
+      <w:r>
+        <w:rPr>
+          <w:b/>
+        </w:rPr>
+        <w:t>Steps 6 &amp; 7: The Autonomous Reasoning Loop.</w:t>
+      </w:r>
+      <w:r>
+        <w:t xml:space="preserve"> `InvokePromptAsync` looks like a single call, but behind the scenes several round-trips happen: the model reads the problem, realizes it needs to subtract 15 from 124, and requests `Math.Subtract(124, 15)`. The Kernel executes the real C# method (printing `[NATIVE CODE EXECUTION] Subtracting 124 - 15` to the console as a side effect so students can literally watch the tool being invoked), and feeds the returned value (109) back to the model. The model repeats this pattern for the multiply and divide steps until it has every number it needs, then writes its final, step-</w:t>
+      </w:r>
+      <w:r>
         <w:lastRenderedPageBreak/>
-        <w:t>nticKernel;</w:t>
-      </w:r>
-    </w:p>
-    <w:p>
-      <w:pPr>
-        <w:pStyle w:val="NoSpacing"/>
-        <w:rPr>
-          <w:rFonts w:ascii="Consolas" w:hAnsi="Consolas"/>
-          <w:sz w:val="19"/>
-        </w:rPr>
-      </w:pPr>
-      <w:r>
-        <w:rPr>
-          <w:rFonts w:ascii="Consolas" w:hAnsi="Consolas"/>
-          <w:sz w:val="19"/>
-        </w:rPr>
-        <w:t>using System.ComponentModel;</w:t>
-      </w:r>
-    </w:p>
-    <w:p>
-      <w:pPr>
-        <w:pStyle w:val="NoSpacing"/>
-        <w:rPr>
-          <w:rFonts w:ascii="Consolas" w:hAnsi="Consolas"/>
-          <w:sz w:val="19"/>
-        </w:rPr>
-      </w:pPr>
-    </w:p>
-    <w:p>
-      <w:pPr>
-        <w:pStyle w:val="NoSpacing"/>
-        <w:rPr>
-          <w:rFonts w:ascii="Consolas" w:hAnsi="Consolas"/>
-          <w:sz w:val="19"/>
-        </w:rPr>
-      </w:pPr>
-      <w:r>
-        <w:rPr>
-          <w:rFonts w:ascii="Consolas" w:hAnsi="Consolas"/>
-          <w:sz w:val="19"/>
-        </w:rPr>
-        <w:t>namespace Calculator</w:t>
-      </w:r>
-    </w:p>
-    <w:p>
-      <w:pPr>
-        <w:pStyle w:val="NoSpacing"/>
-        <w:rPr>
-          <w:rFonts w:ascii="Consolas" w:hAnsi="Consolas"/>
-          <w:sz w:val="19"/>
-        </w:rPr>
-      </w:pPr>
-      <w:r>
-        <w:rPr>
-          <w:rFonts w:ascii="Consolas" w:hAnsi="Consolas"/>
-          <w:sz w:val="19"/>
-        </w:rPr>
-        <w:t>{</w:t>
-      </w:r>
-    </w:p>
-    <w:p>
-      <w:pPr>
-        <w:pStyle w:val="NoSpacing"/>
-        <w:rPr>
-          <w:rFonts w:ascii="Consolas" w:hAnsi="Consolas"/>
-          <w:sz w:val="19"/>
-        </w:rPr>
-      </w:pPr>
-      <w:r>
-        <w:rPr>
-          <w:rFonts w:ascii="Consolas" w:hAnsi="Consolas"/>
-          <w:sz w:val="19"/>
-        </w:rPr>
-        <w:t xml:space="preserve">    // Step 1: Define the Native C# Plugin</w:t>
-      </w:r>
-    </w:p>
-    <w:p>
-      <w:pPr>
-        <w:pStyle w:val="NoSpacing"/>
-        <w:rPr>
-          <w:rFonts w:ascii="Consolas" w:hAnsi="Consolas"/>
-          <w:sz w:val="19"/>
-        </w:rPr>
-      </w:pPr>
-      <w:r>
-        <w:rPr>
-          <w:rFonts w:ascii="Consolas" w:hAnsi="Consolas"/>
-          <w:sz w:val="19"/>
-        </w:rPr>
-        <w:t xml:space="preserve">    public class MathPlugin</w:t>
-      </w:r>
-    </w:p>
-    <w:p>
-      <w:pPr>
-        <w:pStyle w:val="NoSpacing"/>
-        <w:rPr>
-          <w:rFonts w:ascii="Consolas" w:hAnsi="Consolas"/>
-          <w:sz w:val="19"/>
-        </w:rPr>
-      </w:pPr>
-      <w:r>
-        <w:rPr>
-          <w:rFonts w:ascii="Consolas" w:hAnsi="Consolas"/>
-          <w:sz w:val="19"/>
-        </w:rPr>
-        <w:t xml:space="preserve">    {</w:t>
-      </w:r>
-    </w:p>
-    <w:p>
-      <w:pPr>
-        <w:pStyle w:val="NoSpacing"/>
-        <w:rPr>
-          <w:rFonts w:ascii="Consolas" w:hAnsi="Consolas"/>
-          <w:sz w:val="19"/>
-        </w:rPr>
-      </w:pPr>
-      <w:r>
-        <w:rPr>
-          <w:rFonts w:ascii="Consolas" w:hAnsi="Consolas"/>
-          <w:sz w:val="19"/>
-        </w:rPr>
-        <w:t xml:space="preserve">        [KernelFunction("Add")]</w:t>
-      </w:r>
-    </w:p>
-    <w:p>
-      <w:pPr>
-        <w:pStyle w:val="NoSpacing"/>
-        <w:rPr>
-          <w:rFonts w:ascii="Consolas" w:hAnsi="Consolas"/>
-          <w:sz w:val="19"/>
-        </w:rPr>
-      </w:pPr>
-      <w:r>
-        <w:rPr>
-          <w:rFonts w:ascii="Consolas" w:hAnsi="Consolas"/>
-          <w:sz w:val="19"/>
-        </w:rPr>
-        <w:t xml:space="preserve">        [Description("Adds two numbers together.")]</w:t>
-      </w:r>
-    </w:p>
-    <w:p>
-      <w:pPr>
-        <w:pStyle w:val="NoSpacing"/>
-        <w:rPr>
-          <w:rFonts w:ascii="Consolas" w:hAnsi="Consolas"/>
-          <w:sz w:val="19"/>
-        </w:rPr>
-      </w:pPr>
-      <w:r>
-        <w:rPr>
-          <w:rFonts w:ascii="Consolas" w:hAnsi="Consolas"/>
-          <w:sz w:val="19"/>
-        </w:rPr>
-        <w:t xml:space="preserve">        public double Add([Description("The first number to add")] double number1, [Description("The second number to add")] double number2)</w:t>
-      </w:r>
-    </w:p>
-    <w:p>
-      <w:pPr>
-        <w:pStyle w:val="NoSpacing"/>
-        <w:rPr>
-          <w:rFonts w:ascii="Consolas" w:hAnsi="Consolas"/>
-          <w:sz w:val="19"/>
-        </w:rPr>
-      </w:pPr>
-      <w:r>
-        <w:rPr>
-          <w:rFonts w:ascii="Consolas" w:hAnsi="Consolas"/>
-          <w:sz w:val="19"/>
-        </w:rPr>
-        <w:t xml:space="preserve">        {</w:t>
-      </w:r>
-    </w:p>
-    <w:p>
-      <w:pPr>
-        <w:pStyle w:val="NoSpacing"/>
-        <w:rPr>
-          <w:rFonts w:ascii="Consolas" w:hAnsi="Consolas"/>
-          <w:sz w:val="19"/>
-        </w:rPr>
-      </w:pPr>
-      <w:r>
-        <w:rPr>
-          <w:rFonts w:ascii="Consolas" w:hAnsi="Consolas"/>
-          <w:sz w:val="19"/>
-        </w:rPr>
-        <w:t xml:space="preserve">            Console.WriteLine($"[NATIVE CODE EXECUTION] Adding {number1} + {number2}");</w:t>
-      </w:r>
-    </w:p>
-    <w:p>
-      <w:pPr>
-        <w:pStyle w:val="NoSpacing"/>
-        <w:rPr>
-          <w:rFonts w:ascii="Consolas" w:hAnsi="Consolas"/>
-          <w:sz w:val="19"/>
-        </w:rPr>
-      </w:pPr>
-      <w:r>
-        <w:rPr>
-          <w:rFonts w:ascii="Consolas" w:hAnsi="Consolas"/>
-          <w:sz w:val="19"/>
-        </w:rPr>
-        <w:t xml:space="preserve">            return number1 + number2;</w:t>
-      </w:r>
-    </w:p>
-    <w:p>
-      <w:pPr>
-        <w:pStyle w:val="NoSpacing"/>
-        <w:rPr>
-          <w:rFonts w:ascii="Consolas" w:hAnsi="Consolas"/>
-          <w:sz w:val="19"/>
-        </w:rPr>
-      </w:pPr>
-      <w:r>
-        <w:rPr>
-          <w:rFonts w:ascii="Consolas" w:hAnsi="Consolas"/>
-          <w:sz w:val="19"/>
-        </w:rPr>
-        <w:t xml:space="preserve">        }</w:t>
-      </w:r>
-    </w:p>
-    <w:p>
-      <w:pPr>
-        <w:pStyle w:val="NoSpacing"/>
-        <w:rPr>
-          <w:rFonts w:ascii="Consolas" w:hAnsi="Consolas"/>
-          <w:sz w:val="19"/>
-        </w:rPr>
-      </w:pPr>
-    </w:p>
-    <w:p>
-      <w:pPr>
-        <w:pStyle w:val="NoSpacing"/>
-        <w:rPr>
-          <w:rFonts w:ascii="Consolas" w:hAnsi="Consolas"/>
-          <w:sz w:val="19"/>
-        </w:rPr>
-      </w:pPr>
-      <w:r>
-        <w:rPr>
-          <w:rFonts w:ascii="Consolas" w:hAnsi="Consolas"/>
-          <w:sz w:val="19"/>
-        </w:rPr>
-        <w:t xml:space="preserve">        [KernelFunction("Subtract")]</w:t>
-      </w:r>
-    </w:p>
-    <w:p>
-      <w:pPr>
-        <w:pStyle w:val="NoSpacing"/>
-        <w:rPr>
-          <w:rFonts w:ascii="Consolas" w:hAnsi="Consolas"/>
-          <w:sz w:val="19"/>
-        </w:rPr>
-      </w:pPr>
-      <w:r>
-        <w:rPr>
-          <w:rFonts w:ascii="Consolas" w:hAnsi="Consolas"/>
-          <w:sz w:val="19"/>
-        </w:rPr>
-        <w:t xml:space="preserve">        [Description("Subtracts the second number from the first number.")]</w:t>
-      </w:r>
-    </w:p>
-    <w:p>
-      <w:pPr>
-        <w:pStyle w:val="NoSpacing"/>
-        <w:rPr>
-          <w:rFonts w:ascii="Consolas" w:hAnsi="Consolas"/>
-          <w:sz w:val="19"/>
-        </w:rPr>
-      </w:pPr>
-      <w:r>
-        <w:rPr>
-          <w:rFonts w:ascii="Consolas" w:hAnsi="Consolas"/>
-          <w:sz w:val="19"/>
-        </w:rPr>
-        <w:t xml:space="preserve">        public double Subtract([Description("The number to subtract from")] double number1, [Description("The number to subtract")] double number2)</w:t>
-      </w:r>
-    </w:p>
-    <w:p>
-      <w:pPr>
-        <w:pStyle w:val="NoSpacing"/>
-        <w:rPr>
-          <w:rFonts w:ascii="Consolas" w:hAnsi="Consolas"/>
-          <w:sz w:val="19"/>
-        </w:rPr>
-      </w:pPr>
-      <w:r>
-        <w:rPr>
-          <w:rFonts w:ascii="Consolas" w:hAnsi="Consolas"/>
-          <w:sz w:val="19"/>
-        </w:rPr>
-        <w:t xml:space="preserve">        {</w:t>
-      </w:r>
-    </w:p>
-    <w:p>
-      <w:pPr>
-        <w:pStyle w:val="NoSpacing"/>
-        <w:rPr>
-          <w:rFonts w:ascii="Consolas" w:hAnsi="Consolas"/>
-          <w:sz w:val="19"/>
-        </w:rPr>
-      </w:pPr>
-      <w:r>
-        <w:rPr>
-          <w:rFonts w:ascii="Consolas" w:hAnsi="Consolas"/>
-          <w:sz w:val="19"/>
-        </w:rPr>
-        <w:t xml:space="preserve">            Console.WriteLine($"[NATIVE CODE EXECUTION] Subtracting {number1} - {number2}");</w:t>
-      </w:r>
-    </w:p>
-    <w:p>
-      <w:pPr>
-        <w:pStyle w:val="NoSpacing"/>
-        <w:rPr>
-          <w:rFonts w:ascii="Consolas" w:hAnsi="Consolas"/>
-          <w:sz w:val="19"/>
-        </w:rPr>
-      </w:pPr>
-      <w:r>
-        <w:rPr>
-          <w:rFonts w:ascii="Consolas" w:hAnsi="Consolas"/>
-          <w:sz w:val="19"/>
-        </w:rPr>
-        <w:t xml:space="preserve">            return number1 - number2;</w:t>
-      </w:r>
-    </w:p>
-    <w:p>
-      <w:pPr>
-        <w:pStyle w:val="NoSpacing"/>
-        <w:rPr>
-          <w:rFonts w:ascii="Consolas" w:hAnsi="Consolas"/>
-          <w:sz w:val="19"/>
-        </w:rPr>
-      </w:pPr>
-      <w:r>
-        <w:rPr>
-          <w:rFonts w:ascii="Consolas" w:hAnsi="Consolas"/>
-          <w:sz w:val="19"/>
-        </w:rPr>
-        <w:t xml:space="preserve">        }</w:t>
-      </w:r>
-    </w:p>
-    <w:p>
-      <w:pPr>
-        <w:pStyle w:val="NoSpacing"/>
-        <w:rPr>
-          <w:rFonts w:ascii="Consolas" w:hAnsi="Consolas"/>
-          <w:sz w:val="19"/>
-        </w:rPr>
-      </w:pPr>
-    </w:p>
-    <w:p>
-      <w:pPr>
-        <w:pStyle w:val="NoSpacing"/>
-        <w:rPr>
-          <w:rFonts w:ascii="Consolas" w:hAnsi="Consolas"/>
-          <w:sz w:val="19"/>
-        </w:rPr>
-      </w:pPr>
-      <w:r>
-        <w:rPr>
-          <w:rFonts w:ascii="Consolas" w:hAnsi="Consolas"/>
-          <w:sz w:val="19"/>
-        </w:rPr>
-        <w:t xml:space="preserve">        [KernelFunction("Multiply")]</w:t>
-      </w:r>
-    </w:p>
-    <w:p>
-      <w:pPr>
-        <w:pStyle w:val="NoSpacing"/>
-        <w:rPr>
-          <w:rFonts w:ascii="Consolas" w:hAnsi="Consolas"/>
-          <w:sz w:val="19"/>
-        </w:rPr>
-      </w:pPr>
-      <w:r>
-        <w:rPr>
-          <w:rFonts w:ascii="Consolas" w:hAnsi="Consolas"/>
-          <w:sz w:val="19"/>
-        </w:rPr>
-        <w:t xml:space="preserve">        [Description("Multiplies two numbers together.")]</w:t>
-      </w:r>
-    </w:p>
-    <w:p>
-      <w:pPr>
-        <w:pStyle w:val="NoSpacing"/>
-        <w:rPr>
-          <w:rFonts w:ascii="Consolas" w:hAnsi="Consolas"/>
-          <w:sz w:val="19"/>
-        </w:rPr>
-      </w:pPr>
-      <w:r>
-        <w:rPr>
-          <w:rFonts w:ascii="Consolas" w:hAnsi="Consolas"/>
-          <w:sz w:val="19"/>
-        </w:rPr>
-        <w:t xml:space="preserve">        public double Multiply([Description("The first number to multiply")] double number1, [Description("The second number to multiply")] double number2)</w:t>
-      </w:r>
-    </w:p>
-    <w:p>
-      <w:pPr>
-        <w:pStyle w:val="NoSpacing"/>
-        <w:rPr>
-          <w:rFonts w:ascii="Consolas" w:hAnsi="Consolas"/>
-          <w:sz w:val="19"/>
-        </w:rPr>
-      </w:pPr>
-      <w:r>
-        <w:rPr>
-          <w:rFonts w:ascii="Consolas" w:hAnsi="Consolas"/>
-          <w:sz w:val="19"/>
-        </w:rPr>
-        <w:t xml:space="preserve">        {</w:t>
-      </w:r>
-    </w:p>
-    <w:p>
-      <w:pPr>
-        <w:pStyle w:val="NoSpacing"/>
-        <w:rPr>
-          <w:rFonts w:ascii="Consolas" w:hAnsi="Consolas"/>
-          <w:sz w:val="19"/>
-        </w:rPr>
-      </w:pPr>
-      <w:r>
-        <w:rPr>
-          <w:rFonts w:ascii="Consolas" w:hAnsi="Consolas"/>
-          <w:sz w:val="19"/>
-        </w:rPr>
-        <w:t xml:space="preserve">            Console.WriteLine($"[NATIVE CODE EXECUTION] Multiplying {number1} * {number2}");</w:t>
-      </w:r>
-    </w:p>
-    <w:p>
-      <w:pPr>
-        <w:pStyle w:val="NoSpacing"/>
-        <w:rPr>
-          <w:rFonts w:ascii="Consolas" w:hAnsi="Consolas"/>
-          <w:sz w:val="19"/>
-        </w:rPr>
-      </w:pPr>
-      <w:r>
-        <w:rPr>
-          <w:rFonts w:ascii="Consolas" w:hAnsi="Consolas"/>
-          <w:sz w:val="19"/>
-        </w:rPr>
-        <w:t xml:space="preserve">            return number1 * number2;</w:t>
-      </w:r>
-    </w:p>
-    <w:p>
-      <w:pPr>
-        <w:pStyle w:val="NoSpacing"/>
-        <w:rPr>
-          <w:rFonts w:ascii="Consolas" w:hAnsi="Consolas"/>
-          <w:sz w:val="19"/>
-        </w:rPr>
-      </w:pPr>
-      <w:r>
-        <w:rPr>
-          <w:rFonts w:ascii="Consolas" w:hAnsi="Consolas"/>
-          <w:sz w:val="19"/>
-        </w:rPr>
-        <w:t xml:space="preserve">        }</w:t>
-      </w:r>
-    </w:p>
-    <w:p>
-      <w:pPr>
-        <w:pStyle w:val="NoSpacing"/>
-        <w:rPr>
-          <w:rFonts w:ascii="Consolas" w:hAnsi="Consolas"/>
-          <w:sz w:val="19"/>
-        </w:rPr>
-      </w:pPr>
-    </w:p>
-    <w:p>
-      <w:pPr>
-        <w:pStyle w:val="NoSpacing"/>
-        <w:rPr>
-          <w:rFonts w:ascii="Consolas" w:hAnsi="Consolas"/>
-          <w:sz w:val="19"/>
-        </w:rPr>
-      </w:pPr>
-      <w:r>
-        <w:rPr>
-          <w:rFonts w:ascii="Consolas" w:hAnsi="Consolas"/>
-          <w:sz w:val="19"/>
-        </w:rPr>
-        <w:t xml:space="preserve">        [KernelFunction("Divide")]</w:t>
-      </w:r>
-    </w:p>
-    <w:p>
-      <w:pPr>
-        <w:pStyle w:val="NoSpacing"/>
-        <w:rPr>
-          <w:rFonts w:ascii="Consolas" w:hAnsi="Consolas"/>
-          <w:sz w:val="19"/>
-        </w:rPr>
-      </w:pPr>
-      <w:r>
-        <w:rPr>
-          <w:rFonts w:ascii="Consolas" w:hAnsi="Consolas"/>
-          <w:sz w:val="19"/>
-        </w:rPr>
-        <w:t xml:space="preserve">        [Description("Divides the first number by the second number.")]</w:t>
-      </w:r>
-    </w:p>
-    <w:p>
-      <w:pPr>
-        <w:pStyle w:val="NoSpacing"/>
-        <w:rPr>
-          <w:rFonts w:ascii="Consolas" w:hAnsi="Consolas"/>
-          <w:sz w:val="19"/>
-        </w:rPr>
-      </w:pPr>
-      <w:r>
-        <w:rPr>
-          <w:rFonts w:ascii="Consolas" w:hAnsi="Consolas"/>
-          <w:sz w:val="19"/>
-        </w:rPr>
-        <w:t xml:space="preserve">        public double Divide([Description("The number to divide")] double number1, [Description("The number to divide by")] double number2)</w:t>
-      </w:r>
-    </w:p>
-    <w:p>
-      <w:pPr>
-        <w:pStyle w:val="NoSpacing"/>
-        <w:rPr>
-          <w:rFonts w:ascii="Consolas" w:hAnsi="Consolas"/>
-          <w:sz w:val="19"/>
-        </w:rPr>
-      </w:pPr>
-      <w:r>
-        <w:rPr>
-          <w:rFonts w:ascii="Consolas" w:hAnsi="Consolas"/>
-          <w:sz w:val="19"/>
-        </w:rPr>
-        <w:t xml:space="preserve">        {</w:t>
-      </w:r>
-    </w:p>
-    <w:p>
-      <w:pPr>
-        <w:pStyle w:val="NoSpacing"/>
-        <w:rPr>
-          <w:rFonts w:ascii="Consolas" w:hAnsi="Consolas"/>
-          <w:sz w:val="19"/>
-        </w:rPr>
-      </w:pPr>
-      <w:r>
-        <w:rPr>
-          <w:rFonts w:ascii="Consolas" w:hAnsi="Consolas"/>
-          <w:sz w:val="19"/>
-        </w:rPr>
-        <w:t xml:space="preserve">            Console.WriteLine($"[NATIVE CODE EXECUTION] Dividing {number1} / {number2}");</w:t>
-      </w:r>
-    </w:p>
-    <w:p>
-      <w:pPr>
-        <w:pStyle w:val="NoSpacing"/>
-        <w:rPr>
-          <w:rFonts w:ascii="Consolas" w:hAnsi="Consolas"/>
-          <w:sz w:val="19"/>
-        </w:rPr>
-      </w:pPr>
-      <w:r>
-        <w:rPr>
-          <w:rFonts w:ascii="Consolas" w:hAnsi="Consolas"/>
-          <w:sz w:val="19"/>
-        </w:rPr>
-        <w:t xml:space="preserve">            return number1 / number2;</w:t>
-      </w:r>
-    </w:p>
-    <w:p>
-      <w:pPr>
-        <w:pStyle w:val="NoSpacing"/>
-        <w:rPr>
-          <w:rFonts w:ascii="Consolas" w:hAnsi="Consolas"/>
-          <w:sz w:val="19"/>
-        </w:rPr>
-      </w:pPr>
-      <w:r>
-        <w:rPr>
-          <w:rFonts w:ascii="Consolas" w:hAnsi="Consolas"/>
-          <w:sz w:val="19"/>
-        </w:rPr>
-        <w:t xml:space="preserve">        }</w:t>
-      </w:r>
-    </w:p>
-    <w:p>
-      <w:pPr>
-        <w:pStyle w:val="NoSpacing"/>
-        <w:rPr>
-          <w:rFonts w:ascii="Consolas" w:hAnsi="Consolas"/>
-          <w:sz w:val="19"/>
-        </w:rPr>
-      </w:pPr>
-      <w:r>
-        <w:rPr>
-          <w:rFonts w:ascii="Consolas" w:hAnsi="Consolas"/>
-          <w:sz w:val="19"/>
-        </w:rPr>
-        <w:t xml:space="preserve">    }</w:t>
-      </w:r>
-    </w:p>
-    <w:p>
-      <w:pPr>
-        <w:pStyle w:val="NoSpacing"/>
-        <w:rPr>
-          <w:rFonts w:ascii="Consolas" w:hAnsi="Consolas"/>
-          <w:sz w:val="19"/>
-        </w:rPr>
-      </w:pPr>
-      <w:r>
-        <w:rPr>
-          <w:rFonts w:ascii="Consolas" w:hAnsi="Consolas"/>
-          <w:sz w:val="19"/>
-        </w:rPr>
-        <w:t>}</w:t>
-      </w:r>
-    </w:p>
-    <w:p/>
-    <w:p>
-      <w:pPr>
-        <w:pStyle w:val="Heading2"/>
-      </w:pPr>
-      <w:r>
-        <w:t>5. Code Walkthrough &amp; Explanations</w:t>
-      </w:r>
-    </w:p>
-    <w:p>
-      <w:r>
-        <w:rPr>
-          <w:b/>
-        </w:rPr>
-        <w:t>Step 1: Writing the Native Plugin and its Attributes (MathPlugin.cs).</w:t>
-      </w:r>
-      <w:r>
-        <w:t xml:space="preserve"> `MathPlugin` is a plain C# class with four ordinary-looking methods: `Add`, `Subtract`, `Multiply`, and `Divide`. What turns them into AI-callable "tools" is the attributes stacked above each method. `[KernelFunction("Add")]` tells Semantic Kernel "expose this method, and call it `Add` in the tool manifest." The `[Description("...")]` attributes — on the method itself and on every single parameter — are not just for human readers browsing the code. Semantic Kernel serializes these description strings and sends them to Gemini as part of the request. The model reads "Adds two numbers together" and "The first number to add" to decide, purely from natural language, which function matches its current need and which value goes into which parameter.</w:t>
-      </w:r>
-    </w:p>
-    <w:p/>
-    <w:p>
-      <w:r>
-        <w:rPr>
-          <w:b/>
-        </w:rPr>
-        <w:t>Steps 2 &amp; 3: Kernel Setup and Plugin Registration (Program.cs).</w:t>
-      </w:r>
-      <w:r>
-        <w:t xml:space="preserve"> The kernel builder pattern is identical to every previous lesson. The new line is `builder.Plugins.AddFromType&lt;MathPlugin&gt;("Math")`, which happens *before* `builder.Build()`. This registers the plugin under the name `"Math"`, so its functions become addressable as `Math.Add`, `Math.Subtract`, `Math.Multiply`, and `Math.Divide` inside the model's tool-calling system.</w:t>
-      </w:r>
-    </w:p>
-    <w:p/>
-    <w:p>
-      <w:r>
-        <w:rPr>
-          <w:b/>
-        </w:rPr>
-        <w:t>Step 4: The Math Word Problem.</w:t>
-      </w:r>
-      <w:r>
-        <w:t xml:space="preserve"> The prompt is deliberately a chained, multi-step problem (subtract, then multiply, then divide) rather than a single calculation. This is intentional: it forces the model to plan a sequence of tool calls rather than making just one, which is exactly the multi-step reasoning pattern that later multi-agent lessons in this course build on.</w:t>
-      </w:r>
-    </w:p>
-    <w:p/>
-    <w:p>
-      <w:r>
-        <w:rPr>
-          <w:b/>
-        </w:rPr>
-        <w:t>Step 5: Enabling Auto-Invocation.</w:t>
-      </w:r>
-      <w:r>
-        <w:t xml:space="preserve"> This is the most important line in the lesson: `ToolCallBehavior = GeminiToolCallBehavior.AutoInvokeKernelFunctions`. Registering a plugin only makes the model *aware* the tools exist; without this setting, the model would still try to guess the arithmetic itself using its language-modeling instincts (and likely get the multi-step problem wrong). With auto-invocation enabled, Semantic Kernel is authorized to actually execute the native C# method whenever the model requests it, and to feed the exact numeric result back into the model's context automatically.</w:t>
-      </w:r>
-    </w:p>
-    <w:p/>
-    <w:p>
-      <w:r>
-        <w:rPr>
-          <w:b/>
-        </w:rPr>
-        <w:t>Steps 6 &amp; 7: The Autonomous Reasoning Loop.</w:t>
-      </w:r>
-      <w:r>
-        <w:t xml:space="preserve"> `InvokePromptAsync` looks like a single call, but behind the scenes several round-trips happen: the model reads the problem, realizes it needs to subtract 15 from 124, and requests `Math.Subtract(124, 15)`. The Kernel executes the real C# method (printing `[NATIVE CODE EXECUTION] Subtracting 124 - 15` to the console as a side effect so students can literally watch the tool being invoked), and feeds the returned value (109) back to the model. The model repeats this pattern for the multiply and divide steps until it has every number it needs, then writes its final, step-by-step natural-language explanation — which is what ultimately gets printed as the AI response.</w:t>
+        <w:t>by-step natural-language explanation — which is what ultimately gets printed as the AI response.</w:t>
       </w:r>
     </w:p>
     <w:p/>

</xml_diff>